<commit_message>
CAMBIOS importantes en rojo
</commit_message>
<xml_diff>
--- a/Doc_Final/SAMR_SRS_Completo_v1.4.docx
+++ b/Doc_Final/SAMR_SRS_Completo_v1.4.docx
@@ -178,12 +178,6 @@
         <w:gridCol w:w="4680"/>
       </w:tblGrid>
       <w:tr>
-        <w:tblPrEx>
-          <w:tblCellMar>
-            <w:top w:w="0" w:type="dxa"/>
-            <w:bottom w:w="0" w:type="dxa"/>
-          </w:tblCellMar>
-        </w:tblPrEx>
         <w:tc>
           <w:tcPr>
             <w:tcW w:w="4680" w:type="dxa"/>
@@ -240,12 +234,6 @@
         </w:tc>
       </w:tr>
       <w:tr>
-        <w:tblPrEx>
-          <w:tblCellMar>
-            <w:top w:w="0" w:type="dxa"/>
-            <w:bottom w:w="0" w:type="dxa"/>
-          </w:tblCellMar>
-        </w:tblPrEx>
         <w:tc>
           <w:tcPr>
             <w:tcW w:w="4680" w:type="dxa"/>
@@ -294,12 +282,6 @@
         </w:tc>
       </w:tr>
       <w:tr>
-        <w:tblPrEx>
-          <w:tblCellMar>
-            <w:top w:w="0" w:type="dxa"/>
-            <w:bottom w:w="0" w:type="dxa"/>
-          </w:tblCellMar>
-        </w:tblPrEx>
         <w:tc>
           <w:tcPr>
             <w:tcW w:w="4680" w:type="dxa"/>
@@ -353,12 +335,6 @@
         </w:tc>
       </w:tr>
       <w:tr>
-        <w:tblPrEx>
-          <w:tblCellMar>
-            <w:top w:w="0" w:type="dxa"/>
-            <w:bottom w:w="0" w:type="dxa"/>
-          </w:tblCellMar>
-        </w:tblPrEx>
         <w:tc>
           <w:tcPr>
             <w:tcW w:w="4680" w:type="dxa"/>
@@ -412,12 +388,6 @@
         </w:tc>
       </w:tr>
       <w:tr>
-        <w:tblPrEx>
-          <w:tblCellMar>
-            <w:top w:w="0" w:type="dxa"/>
-            <w:bottom w:w="0" w:type="dxa"/>
-          </w:tblCellMar>
-        </w:tblPrEx>
         <w:tc>
           <w:tcPr>
             <w:tcW w:w="4680" w:type="dxa"/>
@@ -466,12 +436,6 @@
         </w:tc>
       </w:tr>
       <w:tr>
-        <w:tblPrEx>
-          <w:tblCellMar>
-            <w:top w:w="0" w:type="dxa"/>
-            <w:bottom w:w="0" w:type="dxa"/>
-          </w:tblCellMar>
-        </w:tblPrEx>
         <w:tc>
           <w:tcPr>
             <w:tcW w:w="4680" w:type="dxa"/>
@@ -525,12 +489,6 @@
         </w:tc>
       </w:tr>
       <w:tr>
-        <w:tblPrEx>
-          <w:tblCellMar>
-            <w:top w:w="0" w:type="dxa"/>
-            <w:bottom w:w="0" w:type="dxa"/>
-          </w:tblCellMar>
-        </w:tblPrEx>
         <w:tc>
           <w:tcPr>
             <w:tcW w:w="4680" w:type="dxa"/>
@@ -629,12 +587,6 @@
         <w:gridCol w:w="1488"/>
       </w:tblGrid>
       <w:tr>
-        <w:tblPrEx>
-          <w:tblCellMar>
-            <w:top w:w="0" w:type="dxa"/>
-            <w:bottom w:w="0" w:type="dxa"/>
-          </w:tblCellMar>
-        </w:tblPrEx>
         <w:tc>
           <w:tcPr>
             <w:tcW w:w="900" w:type="dxa"/>
@@ -772,12 +724,6 @@
         </w:tc>
       </w:tr>
       <w:tr>
-        <w:tblPrEx>
-          <w:tblCellMar>
-            <w:top w:w="0" w:type="dxa"/>
-            <w:bottom w:w="0" w:type="dxa"/>
-          </w:tblCellMar>
-        </w:tblPrEx>
         <w:tc>
           <w:tcPr>
             <w:tcW w:w="900" w:type="dxa"/>
@@ -900,12 +846,6 @@
         </w:tc>
       </w:tr>
       <w:tr>
-        <w:tblPrEx>
-          <w:tblCellMar>
-            <w:top w:w="0" w:type="dxa"/>
-            <w:bottom w:w="0" w:type="dxa"/>
-          </w:tblCellMar>
-        </w:tblPrEx>
         <w:tc>
           <w:tcPr>
             <w:tcW w:w="900" w:type="dxa"/>
@@ -1077,12 +1017,6 @@
         <w:gridCol w:w="1298"/>
       </w:tblGrid>
       <w:tr>
-        <w:tblPrEx>
-          <w:tblCellMar>
-            <w:top w:w="0" w:type="dxa"/>
-            <w:bottom w:w="0" w:type="dxa"/>
-          </w:tblCellMar>
-        </w:tblPrEx>
         <w:tc>
           <w:tcPr>
             <w:tcW w:w="2200" w:type="dxa"/>
@@ -1220,12 +1154,6 @@
         </w:tc>
       </w:tr>
       <w:tr>
-        <w:tblPrEx>
-          <w:tblCellMar>
-            <w:top w:w="0" w:type="dxa"/>
-            <w:bottom w:w="0" w:type="dxa"/>
-          </w:tblCellMar>
-        </w:tblPrEx>
         <w:tc>
           <w:tcPr>
             <w:tcW w:w="2200" w:type="dxa"/>
@@ -1344,12 +1272,6 @@
         </w:tc>
       </w:tr>
       <w:tr>
-        <w:tblPrEx>
-          <w:tblCellMar>
-            <w:top w:w="0" w:type="dxa"/>
-            <w:bottom w:w="0" w:type="dxa"/>
-          </w:tblCellMar>
-        </w:tblPrEx>
         <w:tc>
           <w:tcPr>
             <w:tcW w:w="2200" w:type="dxa"/>
@@ -1726,12 +1648,6 @@
         <w:gridCol w:w="6360"/>
       </w:tblGrid>
       <w:tr>
-        <w:tblPrEx>
-          <w:tblCellMar>
-            <w:top w:w="0" w:type="dxa"/>
-            <w:bottom w:w="0" w:type="dxa"/>
-          </w:tblCellMar>
-        </w:tblPrEx>
         <w:tc>
           <w:tcPr>
             <w:tcW w:w="3000" w:type="dxa"/>
@@ -1788,12 +1704,6 @@
         </w:tc>
       </w:tr>
       <w:tr>
-        <w:tblPrEx>
-          <w:tblCellMar>
-            <w:top w:w="0" w:type="dxa"/>
-            <w:bottom w:w="0" w:type="dxa"/>
-          </w:tblCellMar>
-        </w:tblPrEx>
         <w:tc>
           <w:tcPr>
             <w:tcW w:w="3000" w:type="dxa"/>
@@ -1842,12 +1752,6 @@
         </w:tc>
       </w:tr>
       <w:tr>
-        <w:tblPrEx>
-          <w:tblCellMar>
-            <w:top w:w="0" w:type="dxa"/>
-            <w:bottom w:w="0" w:type="dxa"/>
-          </w:tblCellMar>
-        </w:tblPrEx>
         <w:tc>
           <w:tcPr>
             <w:tcW w:w="3000" w:type="dxa"/>
@@ -1912,12 +1816,6 @@
         </w:tc>
       </w:tr>
       <w:tr>
-        <w:tblPrEx>
-          <w:tblCellMar>
-            <w:top w:w="0" w:type="dxa"/>
-            <w:bottom w:w="0" w:type="dxa"/>
-          </w:tblCellMar>
-        </w:tblPrEx>
         <w:tc>
           <w:tcPr>
             <w:tcW w:w="3000" w:type="dxa"/>
@@ -1966,12 +1864,6 @@
         </w:tc>
       </w:tr>
       <w:tr>
-        <w:tblPrEx>
-          <w:tblCellMar>
-            <w:top w:w="0" w:type="dxa"/>
-            <w:bottom w:w="0" w:type="dxa"/>
-          </w:tblCellMar>
-        </w:tblPrEx>
         <w:tc>
           <w:tcPr>
             <w:tcW w:w="3000" w:type="dxa"/>
@@ -2020,12 +1912,6 @@
         </w:tc>
       </w:tr>
       <w:tr>
-        <w:tblPrEx>
-          <w:tblCellMar>
-            <w:top w:w="0" w:type="dxa"/>
-            <w:bottom w:w="0" w:type="dxa"/>
-          </w:tblCellMar>
-        </w:tblPrEx>
         <w:tc>
           <w:tcPr>
             <w:tcW w:w="3000" w:type="dxa"/>
@@ -2074,12 +1960,6 @@
         </w:tc>
       </w:tr>
       <w:tr>
-        <w:tblPrEx>
-          <w:tblCellMar>
-            <w:top w:w="0" w:type="dxa"/>
-            <w:bottom w:w="0" w:type="dxa"/>
-          </w:tblCellMar>
-        </w:tblPrEx>
         <w:tc>
           <w:tcPr>
             <w:tcW w:w="3000" w:type="dxa"/>
@@ -2128,12 +2008,6 @@
         </w:tc>
       </w:tr>
       <w:tr>
-        <w:tblPrEx>
-          <w:tblCellMar>
-            <w:top w:w="0" w:type="dxa"/>
-            <w:bottom w:w="0" w:type="dxa"/>
-          </w:tblCellMar>
-        </w:tblPrEx>
         <w:tc>
           <w:tcPr>
             <w:tcW w:w="3000" w:type="dxa"/>
@@ -2182,12 +2056,6 @@
         </w:tc>
       </w:tr>
       <w:tr>
-        <w:tblPrEx>
-          <w:tblCellMar>
-            <w:top w:w="0" w:type="dxa"/>
-            <w:bottom w:w="0" w:type="dxa"/>
-          </w:tblCellMar>
-        </w:tblPrEx>
         <w:tc>
           <w:tcPr>
             <w:tcW w:w="3000" w:type="dxa"/>
@@ -2236,12 +2104,6 @@
         </w:tc>
       </w:tr>
       <w:tr>
-        <w:tblPrEx>
-          <w:tblCellMar>
-            <w:top w:w="0" w:type="dxa"/>
-            <w:bottom w:w="0" w:type="dxa"/>
-          </w:tblCellMar>
-        </w:tblPrEx>
         <w:tc>
           <w:tcPr>
             <w:tcW w:w="3000" w:type="dxa"/>
@@ -2290,12 +2152,6 @@
         </w:tc>
       </w:tr>
       <w:tr>
-        <w:tblPrEx>
-          <w:tblCellMar>
-            <w:top w:w="0" w:type="dxa"/>
-            <w:bottom w:w="0" w:type="dxa"/>
-          </w:tblCellMar>
-        </w:tblPrEx>
         <w:tc>
           <w:tcPr>
             <w:tcW w:w="3000" w:type="dxa"/>
@@ -2344,12 +2200,6 @@
         </w:tc>
       </w:tr>
       <w:tr>
-        <w:tblPrEx>
-          <w:tblCellMar>
-            <w:top w:w="0" w:type="dxa"/>
-            <w:bottom w:w="0" w:type="dxa"/>
-          </w:tblCellMar>
-        </w:tblPrEx>
         <w:tc>
           <w:tcPr>
             <w:tcW w:w="3000" w:type="dxa"/>
@@ -2399,12 +2249,6 @@
         </w:tc>
       </w:tr>
       <w:tr>
-        <w:tblPrEx>
-          <w:tblCellMar>
-            <w:top w:w="0" w:type="dxa"/>
-            <w:bottom w:w="0" w:type="dxa"/>
-          </w:tblCellMar>
-        </w:tblPrEx>
         <w:tc>
           <w:tcPr>
             <w:tcW w:w="3000" w:type="dxa"/>
@@ -2458,12 +2302,6 @@
         </w:tc>
       </w:tr>
       <w:tr>
-        <w:tblPrEx>
-          <w:tblCellMar>
-            <w:top w:w="0" w:type="dxa"/>
-            <w:bottom w:w="0" w:type="dxa"/>
-          </w:tblCellMar>
-        </w:tblPrEx>
         <w:tc>
           <w:tcPr>
             <w:tcW w:w="3000" w:type="dxa"/>
@@ -2528,12 +2366,6 @@
         </w:tc>
       </w:tr>
       <w:tr>
-        <w:tblPrEx>
-          <w:tblCellMar>
-            <w:top w:w="0" w:type="dxa"/>
-            <w:bottom w:w="0" w:type="dxa"/>
-          </w:tblCellMar>
-        </w:tblPrEx>
         <w:tc>
           <w:tcPr>
             <w:tcW w:w="3000" w:type="dxa"/>
@@ -2590,12 +2422,6 @@
         </w:tc>
       </w:tr>
       <w:tr>
-        <w:tblPrEx>
-          <w:tblCellMar>
-            <w:top w:w="0" w:type="dxa"/>
-            <w:bottom w:w="0" w:type="dxa"/>
-          </w:tblCellMar>
-        </w:tblPrEx>
         <w:tc>
           <w:tcPr>
             <w:tcW w:w="3000" w:type="dxa"/>
@@ -2644,12 +2470,6 @@
         </w:tc>
       </w:tr>
       <w:tr>
-        <w:tblPrEx>
-          <w:tblCellMar>
-            <w:top w:w="0" w:type="dxa"/>
-            <w:bottom w:w="0" w:type="dxa"/>
-          </w:tblCellMar>
-        </w:tblPrEx>
         <w:tc>
           <w:tcPr>
             <w:tcW w:w="3000" w:type="dxa"/>
@@ -2705,12 +2525,6 @@
         </w:tc>
       </w:tr>
       <w:tr>
-        <w:tblPrEx>
-          <w:tblCellMar>
-            <w:top w:w="0" w:type="dxa"/>
-            <w:bottom w:w="0" w:type="dxa"/>
-          </w:tblCellMar>
-        </w:tblPrEx>
         <w:tc>
           <w:tcPr>
             <w:tcW w:w="3000" w:type="dxa"/>
@@ -2767,12 +2581,6 @@
         </w:tc>
       </w:tr>
       <w:tr>
-        <w:tblPrEx>
-          <w:tblCellMar>
-            <w:top w:w="0" w:type="dxa"/>
-            <w:bottom w:w="0" w:type="dxa"/>
-          </w:tblCellMar>
-        </w:tblPrEx>
         <w:tc>
           <w:tcPr>
             <w:tcW w:w="3000" w:type="dxa"/>
@@ -2831,12 +2639,6 @@
         </w:tc>
       </w:tr>
       <w:tr>
-        <w:tblPrEx>
-          <w:tblCellMar>
-            <w:top w:w="0" w:type="dxa"/>
-            <w:bottom w:w="0" w:type="dxa"/>
-          </w:tblCellMar>
-        </w:tblPrEx>
         <w:tc>
           <w:tcPr>
             <w:tcW w:w="3000" w:type="dxa"/>
@@ -2898,12 +2700,6 @@
         </w:tc>
       </w:tr>
       <w:tr>
-        <w:tblPrEx>
-          <w:tblCellMar>
-            <w:top w:w="0" w:type="dxa"/>
-            <w:bottom w:w="0" w:type="dxa"/>
-          </w:tblCellMar>
-        </w:tblPrEx>
         <w:tc>
           <w:tcPr>
             <w:tcW w:w="3000" w:type="dxa"/>
@@ -2957,12 +2753,6 @@
         </w:tc>
       </w:tr>
       <w:tr>
-        <w:tblPrEx>
-          <w:tblCellMar>
-            <w:top w:w="0" w:type="dxa"/>
-            <w:bottom w:w="0" w:type="dxa"/>
-          </w:tblCellMar>
-        </w:tblPrEx>
         <w:tc>
           <w:tcPr>
             <w:tcW w:w="3000" w:type="dxa"/>
@@ -3016,12 +2806,6 @@
         </w:tc>
       </w:tr>
       <w:tr>
-        <w:tblPrEx>
-          <w:tblCellMar>
-            <w:top w:w="0" w:type="dxa"/>
-            <w:bottom w:w="0" w:type="dxa"/>
-          </w:tblCellMar>
-        </w:tblPrEx>
         <w:tc>
           <w:tcPr>
             <w:tcW w:w="3000" w:type="dxa"/>
@@ -3086,12 +2870,6 @@
         </w:tc>
       </w:tr>
       <w:tr>
-        <w:tblPrEx>
-          <w:tblCellMar>
-            <w:top w:w="0" w:type="dxa"/>
-            <w:bottom w:w="0" w:type="dxa"/>
-          </w:tblCellMar>
-        </w:tblPrEx>
         <w:tc>
           <w:tcPr>
             <w:tcW w:w="3000" w:type="dxa"/>
@@ -3153,12 +2931,6 @@
         </w:tc>
       </w:tr>
       <w:tr>
-        <w:tblPrEx>
-          <w:tblCellMar>
-            <w:top w:w="0" w:type="dxa"/>
-            <w:bottom w:w="0" w:type="dxa"/>
-          </w:tblCellMar>
-        </w:tblPrEx>
         <w:tc>
           <w:tcPr>
             <w:tcW w:w="3000" w:type="dxa"/>
@@ -3608,12 +3380,6 @@
         <w:gridCol w:w="4360"/>
       </w:tblGrid>
       <w:tr>
-        <w:tblPrEx>
-          <w:tblCellMar>
-            <w:top w:w="0" w:type="dxa"/>
-            <w:bottom w:w="0" w:type="dxa"/>
-          </w:tblCellMar>
-        </w:tblPrEx>
         <w:tc>
           <w:tcPr>
             <w:tcW w:w="1800" w:type="dxa"/>
@@ -3724,12 +3490,6 @@
         </w:tc>
       </w:tr>
       <w:tr>
-        <w:tblPrEx>
-          <w:tblCellMar>
-            <w:top w:w="0" w:type="dxa"/>
-            <w:bottom w:w="0" w:type="dxa"/>
-          </w:tblCellMar>
-        </w:tblPrEx>
         <w:tc>
           <w:tcPr>
             <w:tcW w:w="1800" w:type="dxa"/>
@@ -3832,12 +3592,6 @@
         </w:tc>
       </w:tr>
       <w:tr>
-        <w:tblPrEx>
-          <w:tblCellMar>
-            <w:top w:w="0" w:type="dxa"/>
-            <w:bottom w:w="0" w:type="dxa"/>
-          </w:tblCellMar>
-        </w:tblPrEx>
         <w:tc>
           <w:tcPr>
             <w:tcW w:w="1800" w:type="dxa"/>
@@ -3948,12 +3702,6 @@
         </w:tc>
       </w:tr>
       <w:tr>
-        <w:tblPrEx>
-          <w:tblCellMar>
-            <w:top w:w="0" w:type="dxa"/>
-            <w:bottom w:w="0" w:type="dxa"/>
-          </w:tblCellMar>
-        </w:tblPrEx>
         <w:tc>
           <w:tcPr>
             <w:tcW w:w="1800" w:type="dxa"/>
@@ -4048,12 +3796,6 @@
         </w:tc>
       </w:tr>
       <w:tr>
-        <w:tblPrEx>
-          <w:tblCellMar>
-            <w:top w:w="0" w:type="dxa"/>
-            <w:bottom w:w="0" w:type="dxa"/>
-          </w:tblCellMar>
-        </w:tblPrEx>
         <w:tc>
           <w:tcPr>
             <w:tcW w:w="1800" w:type="dxa"/>
@@ -4148,12 +3890,6 @@
         </w:tc>
       </w:tr>
       <w:tr>
-        <w:tblPrEx>
-          <w:tblCellMar>
-            <w:top w:w="0" w:type="dxa"/>
-            <w:bottom w:w="0" w:type="dxa"/>
-          </w:tblCellMar>
-        </w:tblPrEx>
         <w:tc>
           <w:tcPr>
             <w:tcW w:w="1800" w:type="dxa"/>
@@ -4256,12 +3992,6 @@
         </w:tc>
       </w:tr>
       <w:tr>
-        <w:tblPrEx>
-          <w:tblCellMar>
-            <w:top w:w="0" w:type="dxa"/>
-            <w:bottom w:w="0" w:type="dxa"/>
-          </w:tblCellMar>
-        </w:tblPrEx>
         <w:tc>
           <w:tcPr>
             <w:tcW w:w="1800" w:type="dxa"/>
@@ -4357,12 +4087,6 @@
         </w:tc>
       </w:tr>
       <w:tr>
-        <w:tblPrEx>
-          <w:tblCellMar>
-            <w:top w:w="0" w:type="dxa"/>
-            <w:bottom w:w="0" w:type="dxa"/>
-          </w:tblCellMar>
-        </w:tblPrEx>
         <w:tc>
           <w:tcPr>
             <w:tcW w:w="1800" w:type="dxa"/>
@@ -4462,12 +4186,6 @@
         </w:tc>
       </w:tr>
       <w:tr>
-        <w:tblPrEx>
-          <w:tblCellMar>
-            <w:top w:w="0" w:type="dxa"/>
-            <w:bottom w:w="0" w:type="dxa"/>
-          </w:tblCellMar>
-        </w:tblPrEx>
         <w:tc>
           <w:tcPr>
             <w:tcW w:w="1800" w:type="dxa"/>
@@ -4771,12 +4489,6 @@
         <w:gridCol w:w="7160"/>
       </w:tblGrid>
       <w:tr>
-        <w:tblPrEx>
-          <w:tblCellMar>
-            <w:top w:w="0" w:type="dxa"/>
-            <w:bottom w:w="0" w:type="dxa"/>
-          </w:tblCellMar>
-        </w:tblPrEx>
         <w:tc>
           <w:tcPr>
             <w:tcW w:w="9360" w:type="dxa"/>
@@ -4810,12 +4522,6 @@
         </w:tc>
       </w:tr>
       <w:tr>
-        <w:tblPrEx>
-          <w:tblCellMar>
-            <w:top w:w="0" w:type="dxa"/>
-            <w:bottom w:w="0" w:type="dxa"/>
-          </w:tblCellMar>
-        </w:tblPrEx>
         <w:tc>
           <w:tcPr>
             <w:tcW w:w="2200" w:type="dxa"/>
@@ -4868,12 +4574,6 @@
         </w:tc>
       </w:tr>
       <w:tr>
-        <w:tblPrEx>
-          <w:tblCellMar>
-            <w:top w:w="0" w:type="dxa"/>
-            <w:bottom w:w="0" w:type="dxa"/>
-          </w:tblCellMar>
-        </w:tblPrEx>
         <w:tc>
           <w:tcPr>
             <w:tcW w:w="2200" w:type="dxa"/>
@@ -4926,12 +4626,6 @@
         </w:tc>
       </w:tr>
       <w:tr>
-        <w:tblPrEx>
-          <w:tblCellMar>
-            <w:top w:w="0" w:type="dxa"/>
-            <w:bottom w:w="0" w:type="dxa"/>
-          </w:tblCellMar>
-        </w:tblPrEx>
         <w:tc>
           <w:tcPr>
             <w:tcW w:w="2200" w:type="dxa"/>
@@ -4992,12 +4686,6 @@
         </w:tc>
       </w:tr>
       <w:tr>
-        <w:tblPrEx>
-          <w:tblCellMar>
-            <w:top w:w="0" w:type="dxa"/>
-            <w:bottom w:w="0" w:type="dxa"/>
-          </w:tblCellMar>
-        </w:tblPrEx>
         <w:tc>
           <w:tcPr>
             <w:tcW w:w="2200" w:type="dxa"/>
@@ -5050,12 +4738,6 @@
         </w:tc>
       </w:tr>
       <w:tr>
-        <w:tblPrEx>
-          <w:tblCellMar>
-            <w:top w:w="0" w:type="dxa"/>
-            <w:bottom w:w="0" w:type="dxa"/>
-          </w:tblCellMar>
-        </w:tblPrEx>
         <w:tc>
           <w:tcPr>
             <w:tcW w:w="2200" w:type="dxa"/>
@@ -5139,12 +4821,6 @@
         </w:tc>
       </w:tr>
       <w:tr>
-        <w:tblPrEx>
-          <w:tblCellMar>
-            <w:top w:w="0" w:type="dxa"/>
-            <w:bottom w:w="0" w:type="dxa"/>
-          </w:tblCellMar>
-        </w:tblPrEx>
         <w:tc>
           <w:tcPr>
             <w:tcW w:w="2200" w:type="dxa"/>
@@ -5248,12 +4924,6 @@
         </w:tc>
       </w:tr>
       <w:tr>
-        <w:tblPrEx>
-          <w:tblCellMar>
-            <w:top w:w="0" w:type="dxa"/>
-            <w:bottom w:w="0" w:type="dxa"/>
-          </w:tblCellMar>
-        </w:tblPrEx>
         <w:tc>
           <w:tcPr>
             <w:tcW w:w="2200" w:type="dxa"/>
@@ -5369,12 +5039,6 @@
         </w:tc>
       </w:tr>
       <w:tr>
-        <w:tblPrEx>
-          <w:tblCellMar>
-            <w:top w:w="0" w:type="dxa"/>
-            <w:bottom w:w="0" w:type="dxa"/>
-          </w:tblCellMar>
-        </w:tblPrEx>
         <w:tc>
           <w:tcPr>
             <w:tcW w:w="2200" w:type="dxa"/>
@@ -5454,12 +5118,6 @@
         <w:gridCol w:w="7160"/>
       </w:tblGrid>
       <w:tr>
-        <w:tblPrEx>
-          <w:tblCellMar>
-            <w:top w:w="0" w:type="dxa"/>
-            <w:bottom w:w="0" w:type="dxa"/>
-          </w:tblCellMar>
-        </w:tblPrEx>
         <w:tc>
           <w:tcPr>
             <w:tcW w:w="9360" w:type="dxa"/>
@@ -5493,12 +5151,6 @@
         </w:tc>
       </w:tr>
       <w:tr>
-        <w:tblPrEx>
-          <w:tblCellMar>
-            <w:top w:w="0" w:type="dxa"/>
-            <w:bottom w:w="0" w:type="dxa"/>
-          </w:tblCellMar>
-        </w:tblPrEx>
         <w:tc>
           <w:tcPr>
             <w:tcW w:w="2200" w:type="dxa"/>
@@ -5551,12 +5203,6 @@
         </w:tc>
       </w:tr>
       <w:tr>
-        <w:tblPrEx>
-          <w:tblCellMar>
-            <w:top w:w="0" w:type="dxa"/>
-            <w:bottom w:w="0" w:type="dxa"/>
-          </w:tblCellMar>
-        </w:tblPrEx>
         <w:tc>
           <w:tcPr>
             <w:tcW w:w="2200" w:type="dxa"/>
@@ -5609,12 +5255,6 @@
         </w:tc>
       </w:tr>
       <w:tr>
-        <w:tblPrEx>
-          <w:tblCellMar>
-            <w:top w:w="0" w:type="dxa"/>
-            <w:bottom w:w="0" w:type="dxa"/>
-          </w:tblCellMar>
-        </w:tblPrEx>
         <w:tc>
           <w:tcPr>
             <w:tcW w:w="2200" w:type="dxa"/>
@@ -5667,12 +5307,6 @@
         </w:tc>
       </w:tr>
       <w:tr>
-        <w:tblPrEx>
-          <w:tblCellMar>
-            <w:top w:w="0" w:type="dxa"/>
-            <w:bottom w:w="0" w:type="dxa"/>
-          </w:tblCellMar>
-        </w:tblPrEx>
         <w:tc>
           <w:tcPr>
             <w:tcW w:w="2200" w:type="dxa"/>
@@ -5726,12 +5360,6 @@
         </w:tc>
       </w:tr>
       <w:tr>
-        <w:tblPrEx>
-          <w:tblCellMar>
-            <w:top w:w="0" w:type="dxa"/>
-            <w:bottom w:w="0" w:type="dxa"/>
-          </w:tblCellMar>
-        </w:tblPrEx>
         <w:tc>
           <w:tcPr>
             <w:tcW w:w="2200" w:type="dxa"/>
@@ -5815,12 +5443,6 @@
         </w:tc>
       </w:tr>
       <w:tr>
-        <w:tblPrEx>
-          <w:tblCellMar>
-            <w:top w:w="0" w:type="dxa"/>
-            <w:bottom w:w="0" w:type="dxa"/>
-          </w:tblCellMar>
-        </w:tblPrEx>
         <w:tc>
           <w:tcPr>
             <w:tcW w:w="2200" w:type="dxa"/>
@@ -5916,12 +5538,6 @@
         </w:tc>
       </w:tr>
       <w:tr>
-        <w:tblPrEx>
-          <w:tblCellMar>
-            <w:top w:w="0" w:type="dxa"/>
-            <w:bottom w:w="0" w:type="dxa"/>
-          </w:tblCellMar>
-        </w:tblPrEx>
         <w:tc>
           <w:tcPr>
             <w:tcW w:w="2200" w:type="dxa"/>
@@ -6029,12 +5645,6 @@
         </w:tc>
       </w:tr>
       <w:tr>
-        <w:tblPrEx>
-          <w:tblCellMar>
-            <w:top w:w="0" w:type="dxa"/>
-            <w:bottom w:w="0" w:type="dxa"/>
-          </w:tblCellMar>
-        </w:tblPrEx>
         <w:tc>
           <w:tcPr>
             <w:tcW w:w="2200" w:type="dxa"/>
@@ -6114,12 +5724,6 @@
         <w:gridCol w:w="7160"/>
       </w:tblGrid>
       <w:tr>
-        <w:tblPrEx>
-          <w:tblCellMar>
-            <w:top w:w="0" w:type="dxa"/>
-            <w:bottom w:w="0" w:type="dxa"/>
-          </w:tblCellMar>
-        </w:tblPrEx>
         <w:tc>
           <w:tcPr>
             <w:tcW w:w="9360" w:type="dxa"/>
@@ -6153,12 +5757,6 @@
         </w:tc>
       </w:tr>
       <w:tr>
-        <w:tblPrEx>
-          <w:tblCellMar>
-            <w:top w:w="0" w:type="dxa"/>
-            <w:bottom w:w="0" w:type="dxa"/>
-          </w:tblCellMar>
-        </w:tblPrEx>
         <w:tc>
           <w:tcPr>
             <w:tcW w:w="2200" w:type="dxa"/>
@@ -6211,12 +5809,6 @@
         </w:tc>
       </w:tr>
       <w:tr>
-        <w:tblPrEx>
-          <w:tblCellMar>
-            <w:top w:w="0" w:type="dxa"/>
-            <w:bottom w:w="0" w:type="dxa"/>
-          </w:tblCellMar>
-        </w:tblPrEx>
         <w:tc>
           <w:tcPr>
             <w:tcW w:w="2200" w:type="dxa"/>
@@ -6269,12 +5861,6 @@
         </w:tc>
       </w:tr>
       <w:tr>
-        <w:tblPrEx>
-          <w:tblCellMar>
-            <w:top w:w="0" w:type="dxa"/>
-            <w:bottom w:w="0" w:type="dxa"/>
-          </w:tblCellMar>
-        </w:tblPrEx>
         <w:tc>
           <w:tcPr>
             <w:tcW w:w="2200" w:type="dxa"/>
@@ -6343,12 +5929,6 @@
         </w:tc>
       </w:tr>
       <w:tr>
-        <w:tblPrEx>
-          <w:tblCellMar>
-            <w:top w:w="0" w:type="dxa"/>
-            <w:bottom w:w="0" w:type="dxa"/>
-          </w:tblCellMar>
-        </w:tblPrEx>
         <w:tc>
           <w:tcPr>
             <w:tcW w:w="2200" w:type="dxa"/>
@@ -6401,12 +5981,6 @@
         </w:tc>
       </w:tr>
       <w:tr>
-        <w:tblPrEx>
-          <w:tblCellMar>
-            <w:top w:w="0" w:type="dxa"/>
-            <w:bottom w:w="0" w:type="dxa"/>
-          </w:tblCellMar>
-        </w:tblPrEx>
         <w:tc>
           <w:tcPr>
             <w:tcW w:w="2200" w:type="dxa"/>
@@ -6490,12 +6064,6 @@
         </w:tc>
       </w:tr>
       <w:tr>
-        <w:tblPrEx>
-          <w:tblCellMar>
-            <w:top w:w="0" w:type="dxa"/>
-            <w:bottom w:w="0" w:type="dxa"/>
-          </w:tblCellMar>
-        </w:tblPrEx>
         <w:tc>
           <w:tcPr>
             <w:tcW w:w="2200" w:type="dxa"/>
@@ -6599,12 +6167,6 @@
         </w:tc>
       </w:tr>
       <w:tr>
-        <w:tblPrEx>
-          <w:tblCellMar>
-            <w:top w:w="0" w:type="dxa"/>
-            <w:bottom w:w="0" w:type="dxa"/>
-          </w:tblCellMar>
-        </w:tblPrEx>
         <w:tc>
           <w:tcPr>
             <w:tcW w:w="2200" w:type="dxa"/>
@@ -6721,12 +6283,6 @@
         </w:tc>
       </w:tr>
       <w:tr>
-        <w:tblPrEx>
-          <w:tblCellMar>
-            <w:top w:w="0" w:type="dxa"/>
-            <w:bottom w:w="0" w:type="dxa"/>
-          </w:tblCellMar>
-        </w:tblPrEx>
         <w:tc>
           <w:tcPr>
             <w:tcW w:w="2200" w:type="dxa"/>
@@ -6840,12 +6396,6 @@
         <w:gridCol w:w="7160"/>
       </w:tblGrid>
       <w:tr>
-        <w:tblPrEx>
-          <w:tblCellMar>
-            <w:top w:w="0" w:type="dxa"/>
-            <w:bottom w:w="0" w:type="dxa"/>
-          </w:tblCellMar>
-        </w:tblPrEx>
         <w:tc>
           <w:tcPr>
             <w:tcW w:w="9360" w:type="dxa"/>
@@ -6873,18 +6423,26 @@
                 <w:b/>
                 <w:bCs/>
               </w:rPr>
-              <w:t>RF-M2-001: Bot Conversacional de Primera Línea</w:t>
-            </w:r>
-          </w:p>
-        </w:tc>
-      </w:tr>
-      <w:tr>
-        <w:tblPrEx>
-          <w:tblCellMar>
-            <w:top w:w="0" w:type="dxa"/>
-            <w:bottom w:w="0" w:type="dxa"/>
-          </w:tblCellMar>
-        </w:tblPrEx>
+              <w:t>RF-M2-00</w:t>
+            </w:r>
+            <w:r>
+              <w:rPr>
+                <w:b/>
+                <w:bCs/>
+              </w:rPr>
+              <w:t>4</w:t>
+            </w:r>
+            <w:r>
+              <w:rPr>
+                <w:b/>
+                <w:bCs/>
+              </w:rPr>
+              <w:t>: Bot Conversacional de Primera Línea</w:t>
+            </w:r>
+          </w:p>
+        </w:tc>
+      </w:tr>
+      <w:tr>
         <w:tc>
           <w:tcPr>
             <w:tcW w:w="2200" w:type="dxa"/>
@@ -6931,18 +6489,15 @@
           </w:tcPr>
           <w:p>
             <w:r>
-              <w:t>RF-M2-001</w:t>
-            </w:r>
-          </w:p>
-        </w:tc>
-      </w:tr>
-      <w:tr>
-        <w:tblPrEx>
-          <w:tblCellMar>
-            <w:top w:w="0" w:type="dxa"/>
-            <w:bottom w:w="0" w:type="dxa"/>
-          </w:tblCellMar>
-        </w:tblPrEx>
+              <w:t>RF-M2-00</w:t>
+            </w:r>
+            <w:r>
+              <w:t>4</w:t>
+            </w:r>
+          </w:p>
+        </w:tc>
+      </w:tr>
+      <w:tr>
         <w:tc>
           <w:tcPr>
             <w:tcW w:w="2200" w:type="dxa"/>
@@ -6995,12 +6550,6 @@
         </w:tc>
       </w:tr>
       <w:tr>
-        <w:tblPrEx>
-          <w:tblCellMar>
-            <w:top w:w="0" w:type="dxa"/>
-            <w:bottom w:w="0" w:type="dxa"/>
-          </w:tblCellMar>
-        </w:tblPrEx>
         <w:tc>
           <w:tcPr>
             <w:tcW w:w="2200" w:type="dxa"/>
@@ -7101,12 +6650,6 @@
         </w:tc>
       </w:tr>
       <w:tr>
-        <w:tblPrEx>
-          <w:tblCellMar>
-            <w:top w:w="0" w:type="dxa"/>
-            <w:bottom w:w="0" w:type="dxa"/>
-          </w:tblCellMar>
-        </w:tblPrEx>
         <w:tc>
           <w:tcPr>
             <w:tcW w:w="2200" w:type="dxa"/>
@@ -7159,12 +6702,6 @@
         </w:tc>
       </w:tr>
       <w:tr>
-        <w:tblPrEx>
-          <w:tblCellMar>
-            <w:top w:w="0" w:type="dxa"/>
-            <w:bottom w:w="0" w:type="dxa"/>
-          </w:tblCellMar>
-        </w:tblPrEx>
         <w:tc>
           <w:tcPr>
             <w:tcW w:w="2200" w:type="dxa"/>
@@ -7264,12 +6801,6 @@
         </w:tc>
       </w:tr>
       <w:tr>
-        <w:tblPrEx>
-          <w:tblCellMar>
-            <w:top w:w="0" w:type="dxa"/>
-            <w:bottom w:w="0" w:type="dxa"/>
-          </w:tblCellMar>
-        </w:tblPrEx>
         <w:tc>
           <w:tcPr>
             <w:tcW w:w="2200" w:type="dxa"/>
@@ -7389,12 +6920,6 @@
         </w:tc>
       </w:tr>
       <w:tr>
-        <w:tblPrEx>
-          <w:tblCellMar>
-            <w:top w:w="0" w:type="dxa"/>
-            <w:bottom w:w="0" w:type="dxa"/>
-          </w:tblCellMar>
-        </w:tblPrEx>
         <w:tc>
           <w:tcPr>
             <w:tcW w:w="2200" w:type="dxa"/>
@@ -7526,12 +7051,6 @@
         </w:tc>
       </w:tr>
       <w:tr>
-        <w:tblPrEx>
-          <w:tblCellMar>
-            <w:top w:w="0" w:type="dxa"/>
-            <w:bottom w:w="0" w:type="dxa"/>
-          </w:tblCellMar>
-        </w:tblPrEx>
         <w:tc>
           <w:tcPr>
             <w:tcW w:w="2200" w:type="dxa"/>
@@ -7627,12 +7146,6 @@
         <w:gridCol w:w="7160"/>
       </w:tblGrid>
       <w:tr>
-        <w:tblPrEx>
-          <w:tblCellMar>
-            <w:top w:w="0" w:type="dxa"/>
-            <w:bottom w:w="0" w:type="dxa"/>
-          </w:tblCellMar>
-        </w:tblPrEx>
         <w:tc>
           <w:tcPr>
             <w:tcW w:w="9360" w:type="dxa"/>
@@ -7683,12 +7196,6 @@
         </w:tc>
       </w:tr>
       <w:tr>
-        <w:tblPrEx>
-          <w:tblCellMar>
-            <w:top w:w="0" w:type="dxa"/>
-            <w:bottom w:w="0" w:type="dxa"/>
-          </w:tblCellMar>
-        </w:tblPrEx>
         <w:tc>
           <w:tcPr>
             <w:tcW w:w="2200" w:type="dxa"/>
@@ -7735,18 +7242,15 @@
           </w:tcPr>
           <w:p>
             <w:r>
-              <w:t>RF-M2-002</w:t>
-            </w:r>
-          </w:p>
-        </w:tc>
-      </w:tr>
-      <w:tr>
-        <w:tblPrEx>
-          <w:tblCellMar>
-            <w:top w:w="0" w:type="dxa"/>
-            <w:bottom w:w="0" w:type="dxa"/>
-          </w:tblCellMar>
-        </w:tblPrEx>
+              <w:t>RF-M2-00</w:t>
+            </w:r>
+            <w:r>
+              <w:t>5</w:t>
+            </w:r>
+          </w:p>
+        </w:tc>
+      </w:tr>
+      <w:tr>
         <w:tc>
           <w:tcPr>
             <w:tcW w:w="2200" w:type="dxa"/>
@@ -7807,12 +7311,6 @@
         </w:tc>
       </w:tr>
       <w:tr>
-        <w:tblPrEx>
-          <w:tblCellMar>
-            <w:top w:w="0" w:type="dxa"/>
-            <w:bottom w:w="0" w:type="dxa"/>
-          </w:tblCellMar>
-        </w:tblPrEx>
         <w:tc>
           <w:tcPr>
             <w:tcW w:w="2200" w:type="dxa"/>
@@ -7889,12 +7387,6 @@
         </w:tc>
       </w:tr>
       <w:tr>
-        <w:tblPrEx>
-          <w:tblCellMar>
-            <w:top w:w="0" w:type="dxa"/>
-            <w:bottom w:w="0" w:type="dxa"/>
-          </w:tblCellMar>
-        </w:tblPrEx>
         <w:tc>
           <w:tcPr>
             <w:tcW w:w="2200" w:type="dxa"/>
@@ -7947,12 +7439,6 @@
         </w:tc>
       </w:tr>
       <w:tr>
-        <w:tblPrEx>
-          <w:tblCellMar>
-            <w:top w:w="0" w:type="dxa"/>
-            <w:bottom w:w="0" w:type="dxa"/>
-          </w:tblCellMar>
-        </w:tblPrEx>
         <w:tc>
           <w:tcPr>
             <w:tcW w:w="2200" w:type="dxa"/>
@@ -8052,12 +7538,6 @@
         </w:tc>
       </w:tr>
       <w:tr>
-        <w:tblPrEx>
-          <w:tblCellMar>
-            <w:top w:w="0" w:type="dxa"/>
-            <w:bottom w:w="0" w:type="dxa"/>
-          </w:tblCellMar>
-        </w:tblPrEx>
         <w:tc>
           <w:tcPr>
             <w:tcW w:w="2200" w:type="dxa"/>
@@ -8153,12 +7633,6 @@
         </w:tc>
       </w:tr>
       <w:tr>
-        <w:tblPrEx>
-          <w:tblCellMar>
-            <w:top w:w="0" w:type="dxa"/>
-            <w:bottom w:w="0" w:type="dxa"/>
-          </w:tblCellMar>
-        </w:tblPrEx>
         <w:tc>
           <w:tcPr>
             <w:tcW w:w="2200" w:type="dxa"/>
@@ -8282,12 +7756,6 @@
         </w:tc>
       </w:tr>
       <w:tr>
-        <w:tblPrEx>
-          <w:tblCellMar>
-            <w:top w:w="0" w:type="dxa"/>
-            <w:bottom w:w="0" w:type="dxa"/>
-          </w:tblCellMar>
-        </w:tblPrEx>
         <w:tc>
           <w:tcPr>
             <w:tcW w:w="2200" w:type="dxa"/>
@@ -8367,12 +7835,6 @@
         <w:gridCol w:w="7160"/>
       </w:tblGrid>
       <w:tr>
-        <w:tblPrEx>
-          <w:tblCellMar>
-            <w:top w:w="0" w:type="dxa"/>
-            <w:bottom w:w="0" w:type="dxa"/>
-          </w:tblCellMar>
-        </w:tblPrEx>
         <w:tc>
           <w:tcPr>
             <w:tcW w:w="9360" w:type="dxa"/>
@@ -8406,12 +7868,6 @@
         </w:tc>
       </w:tr>
       <w:tr>
-        <w:tblPrEx>
-          <w:tblCellMar>
-            <w:top w:w="0" w:type="dxa"/>
-            <w:bottom w:w="0" w:type="dxa"/>
-          </w:tblCellMar>
-        </w:tblPrEx>
         <w:tc>
           <w:tcPr>
             <w:tcW w:w="2200" w:type="dxa"/>
@@ -8458,18 +7914,15 @@
           </w:tcPr>
           <w:p>
             <w:r>
-              <w:t>RF-M2-003</w:t>
-            </w:r>
-          </w:p>
-        </w:tc>
-      </w:tr>
-      <w:tr>
-        <w:tblPrEx>
-          <w:tblCellMar>
-            <w:top w:w="0" w:type="dxa"/>
-            <w:bottom w:w="0" w:type="dxa"/>
-          </w:tblCellMar>
-        </w:tblPrEx>
+              <w:t>RF-M2-00</w:t>
+            </w:r>
+            <w:r>
+              <w:t>6</w:t>
+            </w:r>
+          </w:p>
+        </w:tc>
+      </w:tr>
+      <w:tr>
         <w:tc>
           <w:tcPr>
             <w:tcW w:w="2200" w:type="dxa"/>
@@ -8522,12 +7975,6 @@
         </w:tc>
       </w:tr>
       <w:tr>
-        <w:tblPrEx>
-          <w:tblCellMar>
-            <w:top w:w="0" w:type="dxa"/>
-            <w:bottom w:w="0" w:type="dxa"/>
-          </w:tblCellMar>
-        </w:tblPrEx>
         <w:tc>
           <w:tcPr>
             <w:tcW w:w="2200" w:type="dxa"/>
@@ -8596,12 +8043,6 @@
         </w:tc>
       </w:tr>
       <w:tr>
-        <w:tblPrEx>
-          <w:tblCellMar>
-            <w:top w:w="0" w:type="dxa"/>
-            <w:bottom w:w="0" w:type="dxa"/>
-          </w:tblCellMar>
-        </w:tblPrEx>
         <w:tc>
           <w:tcPr>
             <w:tcW w:w="2200" w:type="dxa"/>
@@ -8654,12 +8095,6 @@
         </w:tc>
       </w:tr>
       <w:tr>
-        <w:tblPrEx>
-          <w:tblCellMar>
-            <w:top w:w="0" w:type="dxa"/>
-            <w:bottom w:w="0" w:type="dxa"/>
-          </w:tblCellMar>
-        </w:tblPrEx>
         <w:tc>
           <w:tcPr>
             <w:tcW w:w="2200" w:type="dxa"/>
@@ -8760,12 +8195,6 @@
         </w:tc>
       </w:tr>
       <w:tr>
-        <w:tblPrEx>
-          <w:tblCellMar>
-            <w:top w:w="0" w:type="dxa"/>
-            <w:bottom w:w="0" w:type="dxa"/>
-          </w:tblCellMar>
-        </w:tblPrEx>
         <w:tc>
           <w:tcPr>
             <w:tcW w:w="2200" w:type="dxa"/>
@@ -8861,12 +8290,6 @@
         </w:tc>
       </w:tr>
       <w:tr>
-        <w:tblPrEx>
-          <w:tblCellMar>
-            <w:top w:w="0" w:type="dxa"/>
-            <w:bottom w:w="0" w:type="dxa"/>
-          </w:tblCellMar>
-        </w:tblPrEx>
         <w:tc>
           <w:tcPr>
             <w:tcW w:w="2200" w:type="dxa"/>
@@ -8990,12 +8413,6 @@
         </w:tc>
       </w:tr>
       <w:tr>
-        <w:tblPrEx>
-          <w:tblCellMar>
-            <w:top w:w="0" w:type="dxa"/>
-            <w:bottom w:w="0" w:type="dxa"/>
-          </w:tblCellMar>
-        </w:tblPrEx>
         <w:tc>
           <w:tcPr>
             <w:tcW w:w="2200" w:type="dxa"/>
@@ -9075,12 +8492,6 @@
         <w:gridCol w:w="7160"/>
       </w:tblGrid>
       <w:tr>
-        <w:tblPrEx>
-          <w:tblCellMar>
-            <w:top w:w="0" w:type="dxa"/>
-            <w:bottom w:w="0" w:type="dxa"/>
-          </w:tblCellMar>
-        </w:tblPrEx>
         <w:tc>
           <w:tcPr>
             <w:tcW w:w="9360" w:type="dxa"/>
@@ -9123,12 +8534,6 @@
         </w:tc>
       </w:tr>
       <w:tr>
-        <w:tblPrEx>
-          <w:tblCellMar>
-            <w:top w:w="0" w:type="dxa"/>
-            <w:bottom w:w="0" w:type="dxa"/>
-          </w:tblCellMar>
-        </w:tblPrEx>
         <w:tc>
           <w:tcPr>
             <w:tcW w:w="2200" w:type="dxa"/>
@@ -9181,12 +8586,6 @@
         </w:tc>
       </w:tr>
       <w:tr>
-        <w:tblPrEx>
-          <w:tblCellMar>
-            <w:top w:w="0" w:type="dxa"/>
-            <w:bottom w:w="0" w:type="dxa"/>
-          </w:tblCellMar>
-        </w:tblPrEx>
         <w:tc>
           <w:tcPr>
             <w:tcW w:w="2200" w:type="dxa"/>
@@ -9244,12 +8643,6 @@
         </w:tc>
       </w:tr>
       <w:tr>
-        <w:tblPrEx>
-          <w:tblCellMar>
-            <w:top w:w="0" w:type="dxa"/>
-            <w:bottom w:w="0" w:type="dxa"/>
-          </w:tblCellMar>
-        </w:tblPrEx>
         <w:tc>
           <w:tcPr>
             <w:tcW w:w="2200" w:type="dxa"/>
@@ -9318,12 +8711,6 @@
         </w:tc>
       </w:tr>
       <w:tr>
-        <w:tblPrEx>
-          <w:tblCellMar>
-            <w:top w:w="0" w:type="dxa"/>
-            <w:bottom w:w="0" w:type="dxa"/>
-          </w:tblCellMar>
-        </w:tblPrEx>
         <w:tc>
           <w:tcPr>
             <w:tcW w:w="2200" w:type="dxa"/>
@@ -9376,12 +8763,6 @@
         </w:tc>
       </w:tr>
       <w:tr>
-        <w:tblPrEx>
-          <w:tblCellMar>
-            <w:top w:w="0" w:type="dxa"/>
-            <w:bottom w:w="0" w:type="dxa"/>
-          </w:tblCellMar>
-        </w:tblPrEx>
         <w:tc>
           <w:tcPr>
             <w:tcW w:w="2200" w:type="dxa"/>
@@ -9493,12 +8874,6 @@
         </w:tc>
       </w:tr>
       <w:tr>
-        <w:tblPrEx>
-          <w:tblCellMar>
-            <w:top w:w="0" w:type="dxa"/>
-            <w:bottom w:w="0" w:type="dxa"/>
-          </w:tblCellMar>
-        </w:tblPrEx>
         <w:tc>
           <w:tcPr>
             <w:tcW w:w="2200" w:type="dxa"/>
@@ -9631,12 +9006,6 @@
         </w:tc>
       </w:tr>
       <w:tr>
-        <w:tblPrEx>
-          <w:tblCellMar>
-            <w:top w:w="0" w:type="dxa"/>
-            <w:bottom w:w="0" w:type="dxa"/>
-          </w:tblCellMar>
-        </w:tblPrEx>
         <w:tc>
           <w:tcPr>
             <w:tcW w:w="2200" w:type="dxa"/>
@@ -9761,12 +9130,6 @@
         </w:tc>
       </w:tr>
       <w:tr>
-        <w:tblPrEx>
-          <w:tblCellMar>
-            <w:top w:w="0" w:type="dxa"/>
-            <w:bottom w:w="0" w:type="dxa"/>
-          </w:tblCellMar>
-        </w:tblPrEx>
         <w:tc>
           <w:tcPr>
             <w:tcW w:w="2200" w:type="dxa"/>
@@ -9885,12 +9248,6 @@
         <w:gridCol w:w="7160"/>
       </w:tblGrid>
       <w:tr>
-        <w:tblPrEx>
-          <w:tblCellMar>
-            <w:top w:w="0" w:type="dxa"/>
-            <w:bottom w:w="0" w:type="dxa"/>
-          </w:tblCellMar>
-        </w:tblPrEx>
         <w:tc>
           <w:tcPr>
             <w:tcW w:w="9360" w:type="dxa"/>
@@ -9940,12 +9297,6 @@
         </w:tc>
       </w:tr>
       <w:tr>
-        <w:tblPrEx>
-          <w:tblCellMar>
-            <w:top w:w="0" w:type="dxa"/>
-            <w:bottom w:w="0" w:type="dxa"/>
-          </w:tblCellMar>
-        </w:tblPrEx>
         <w:tc>
           <w:tcPr>
             <w:tcW w:w="2200" w:type="dxa"/>
@@ -9998,12 +9349,6 @@
         </w:tc>
       </w:tr>
       <w:tr>
-        <w:tblPrEx>
-          <w:tblCellMar>
-            <w:top w:w="0" w:type="dxa"/>
-            <w:bottom w:w="0" w:type="dxa"/>
-          </w:tblCellMar>
-        </w:tblPrEx>
         <w:tc>
           <w:tcPr>
             <w:tcW w:w="2200" w:type="dxa"/>
@@ -10064,12 +9409,6 @@
         </w:tc>
       </w:tr>
       <w:tr>
-        <w:tblPrEx>
-          <w:tblCellMar>
-            <w:top w:w="0" w:type="dxa"/>
-            <w:bottom w:w="0" w:type="dxa"/>
-          </w:tblCellMar>
-        </w:tblPrEx>
         <w:tc>
           <w:tcPr>
             <w:tcW w:w="2200" w:type="dxa"/>
@@ -10130,12 +9469,6 @@
         </w:tc>
       </w:tr>
       <w:tr>
-        <w:tblPrEx>
-          <w:tblCellMar>
-            <w:top w:w="0" w:type="dxa"/>
-            <w:bottom w:w="0" w:type="dxa"/>
-          </w:tblCellMar>
-        </w:tblPrEx>
         <w:tc>
           <w:tcPr>
             <w:tcW w:w="2200" w:type="dxa"/>
@@ -10188,12 +9521,6 @@
         </w:tc>
       </w:tr>
       <w:tr>
-        <w:tblPrEx>
-          <w:tblCellMar>
-            <w:top w:w="0" w:type="dxa"/>
-            <w:bottom w:w="0" w:type="dxa"/>
-          </w:tblCellMar>
-        </w:tblPrEx>
         <w:tc>
           <w:tcPr>
             <w:tcW w:w="2200" w:type="dxa"/>
@@ -10277,12 +9604,6 @@
         </w:tc>
       </w:tr>
       <w:tr>
-        <w:tblPrEx>
-          <w:tblCellMar>
-            <w:top w:w="0" w:type="dxa"/>
-            <w:bottom w:w="0" w:type="dxa"/>
-          </w:tblCellMar>
-        </w:tblPrEx>
         <w:tc>
           <w:tcPr>
             <w:tcW w:w="2200" w:type="dxa"/>
@@ -10378,12 +9699,6 @@
         </w:tc>
       </w:tr>
       <w:tr>
-        <w:tblPrEx>
-          <w:tblCellMar>
-            <w:top w:w="0" w:type="dxa"/>
-            <w:bottom w:w="0" w:type="dxa"/>
-          </w:tblCellMar>
-        </w:tblPrEx>
         <w:tc>
           <w:tcPr>
             <w:tcW w:w="2200" w:type="dxa"/>
@@ -10500,12 +9815,6 @@
         </w:tc>
       </w:tr>
       <w:tr>
-        <w:tblPrEx>
-          <w:tblCellMar>
-            <w:top w:w="0" w:type="dxa"/>
-            <w:bottom w:w="0" w:type="dxa"/>
-          </w:tblCellMar>
-        </w:tblPrEx>
         <w:tc>
           <w:tcPr>
             <w:tcW w:w="2200" w:type="dxa"/>
@@ -10613,12 +9922,6 @@
         <w:gridCol w:w="7160"/>
       </w:tblGrid>
       <w:tr>
-        <w:tblPrEx>
-          <w:tblCellMar>
-            <w:top w:w="0" w:type="dxa"/>
-            <w:bottom w:w="0" w:type="dxa"/>
-          </w:tblCellMar>
-        </w:tblPrEx>
         <w:tc>
           <w:tcPr>
             <w:tcW w:w="9360" w:type="dxa"/>
@@ -10661,12 +9964,6 @@
         </w:tc>
       </w:tr>
       <w:tr>
-        <w:tblPrEx>
-          <w:tblCellMar>
-            <w:top w:w="0" w:type="dxa"/>
-            <w:bottom w:w="0" w:type="dxa"/>
-          </w:tblCellMar>
-        </w:tblPrEx>
         <w:tc>
           <w:tcPr>
             <w:tcW w:w="2200" w:type="dxa"/>
@@ -10719,12 +10016,6 @@
         </w:tc>
       </w:tr>
       <w:tr>
-        <w:tblPrEx>
-          <w:tblCellMar>
-            <w:top w:w="0" w:type="dxa"/>
-            <w:bottom w:w="0" w:type="dxa"/>
-          </w:tblCellMar>
-        </w:tblPrEx>
         <w:tc>
           <w:tcPr>
             <w:tcW w:w="2200" w:type="dxa"/>
@@ -10782,12 +10073,6 @@
         </w:tc>
       </w:tr>
       <w:tr>
-        <w:tblPrEx>
-          <w:tblCellMar>
-            <w:top w:w="0" w:type="dxa"/>
-            <w:bottom w:w="0" w:type="dxa"/>
-          </w:tblCellMar>
-        </w:tblPrEx>
         <w:tc>
           <w:tcPr>
             <w:tcW w:w="2200" w:type="dxa"/>
@@ -10840,12 +10125,6 @@
         </w:tc>
       </w:tr>
       <w:tr>
-        <w:tblPrEx>
-          <w:tblCellMar>
-            <w:top w:w="0" w:type="dxa"/>
-            <w:bottom w:w="0" w:type="dxa"/>
-          </w:tblCellMar>
-        </w:tblPrEx>
         <w:tc>
           <w:tcPr>
             <w:tcW w:w="2200" w:type="dxa"/>
@@ -10898,12 +10177,6 @@
         </w:tc>
       </w:tr>
       <w:tr>
-        <w:tblPrEx>
-          <w:tblCellMar>
-            <w:top w:w="0" w:type="dxa"/>
-            <w:bottom w:w="0" w:type="dxa"/>
-          </w:tblCellMar>
-        </w:tblPrEx>
         <w:tc>
           <w:tcPr>
             <w:tcW w:w="2200" w:type="dxa"/>
@@ -10995,12 +10268,6 @@
         </w:tc>
       </w:tr>
       <w:tr>
-        <w:tblPrEx>
-          <w:tblCellMar>
-            <w:top w:w="0" w:type="dxa"/>
-            <w:bottom w:w="0" w:type="dxa"/>
-          </w:tblCellMar>
-        </w:tblPrEx>
         <w:tc>
           <w:tcPr>
             <w:tcW w:w="2200" w:type="dxa"/>
@@ -11104,12 +10371,6 @@
         </w:tc>
       </w:tr>
       <w:tr>
-        <w:tblPrEx>
-          <w:tblCellMar>
-            <w:top w:w="0" w:type="dxa"/>
-            <w:bottom w:w="0" w:type="dxa"/>
-          </w:tblCellMar>
-        </w:tblPrEx>
         <w:tc>
           <w:tcPr>
             <w:tcW w:w="2200" w:type="dxa"/>
@@ -11217,12 +10478,6 @@
         </w:tc>
       </w:tr>
       <w:tr>
-        <w:tblPrEx>
-          <w:tblCellMar>
-            <w:top w:w="0" w:type="dxa"/>
-            <w:bottom w:w="0" w:type="dxa"/>
-          </w:tblCellMar>
-        </w:tblPrEx>
         <w:tc>
           <w:tcPr>
             <w:tcW w:w="2200" w:type="dxa"/>
@@ -11302,12 +10557,6 @@
         <w:gridCol w:w="7160"/>
       </w:tblGrid>
       <w:tr>
-        <w:tblPrEx>
-          <w:tblCellMar>
-            <w:top w:w="0" w:type="dxa"/>
-            <w:bottom w:w="0" w:type="dxa"/>
-          </w:tblCellMar>
-        </w:tblPrEx>
         <w:tc>
           <w:tcPr>
             <w:tcW w:w="9360" w:type="dxa"/>
@@ -11341,12 +10590,6 @@
         </w:tc>
       </w:tr>
       <w:tr>
-        <w:tblPrEx>
-          <w:tblCellMar>
-            <w:top w:w="0" w:type="dxa"/>
-            <w:bottom w:w="0" w:type="dxa"/>
-          </w:tblCellMar>
-        </w:tblPrEx>
         <w:tc>
           <w:tcPr>
             <w:tcW w:w="2200" w:type="dxa"/>
@@ -11400,12 +10643,6 @@
         </w:tc>
       </w:tr>
       <w:tr>
-        <w:tblPrEx>
-          <w:tblCellMar>
-            <w:top w:w="0" w:type="dxa"/>
-            <w:bottom w:w="0" w:type="dxa"/>
-          </w:tblCellMar>
-        </w:tblPrEx>
         <w:tc>
           <w:tcPr>
             <w:tcW w:w="2200" w:type="dxa"/>
@@ -11458,12 +10695,6 @@
         </w:tc>
       </w:tr>
       <w:tr>
-        <w:tblPrEx>
-          <w:tblCellMar>
-            <w:top w:w="0" w:type="dxa"/>
-            <w:bottom w:w="0" w:type="dxa"/>
-          </w:tblCellMar>
-        </w:tblPrEx>
         <w:tc>
           <w:tcPr>
             <w:tcW w:w="2200" w:type="dxa"/>
@@ -11516,12 +10747,6 @@
         </w:tc>
       </w:tr>
       <w:tr>
-        <w:tblPrEx>
-          <w:tblCellMar>
-            <w:top w:w="0" w:type="dxa"/>
-            <w:bottom w:w="0" w:type="dxa"/>
-          </w:tblCellMar>
-        </w:tblPrEx>
         <w:tc>
           <w:tcPr>
             <w:tcW w:w="2200" w:type="dxa"/>
@@ -11574,12 +10799,6 @@
         </w:tc>
       </w:tr>
       <w:tr>
-        <w:tblPrEx>
-          <w:tblCellMar>
-            <w:top w:w="0" w:type="dxa"/>
-            <w:bottom w:w="0" w:type="dxa"/>
-          </w:tblCellMar>
-        </w:tblPrEx>
         <w:tc>
           <w:tcPr>
             <w:tcW w:w="2200" w:type="dxa"/>
@@ -11671,12 +10890,6 @@
         </w:tc>
       </w:tr>
       <w:tr>
-        <w:tblPrEx>
-          <w:tblCellMar>
-            <w:top w:w="0" w:type="dxa"/>
-            <w:bottom w:w="0" w:type="dxa"/>
-          </w:tblCellMar>
-        </w:tblPrEx>
         <w:tc>
           <w:tcPr>
             <w:tcW w:w="2200" w:type="dxa"/>
@@ -11772,12 +10985,6 @@
         </w:tc>
       </w:tr>
       <w:tr>
-        <w:tblPrEx>
-          <w:tblCellMar>
-            <w:top w:w="0" w:type="dxa"/>
-            <w:bottom w:w="0" w:type="dxa"/>
-          </w:tblCellMar>
-        </w:tblPrEx>
         <w:tc>
           <w:tcPr>
             <w:tcW w:w="2200" w:type="dxa"/>
@@ -11885,12 +11092,6 @@
         </w:tc>
       </w:tr>
       <w:tr>
-        <w:tblPrEx>
-          <w:tblCellMar>
-            <w:top w:w="0" w:type="dxa"/>
-            <w:bottom w:w="0" w:type="dxa"/>
-          </w:tblCellMar>
-        </w:tblPrEx>
         <w:tc>
           <w:tcPr>
             <w:tcW w:w="2200" w:type="dxa"/>
@@ -11970,12 +11171,6 @@
         <w:gridCol w:w="7160"/>
       </w:tblGrid>
       <w:tr>
-        <w:tblPrEx>
-          <w:tblCellMar>
-            <w:top w:w="0" w:type="dxa"/>
-            <w:bottom w:w="0" w:type="dxa"/>
-          </w:tblCellMar>
-        </w:tblPrEx>
         <w:tc>
           <w:tcPr>
             <w:tcW w:w="9360" w:type="dxa"/>
@@ -12009,12 +11204,6 @@
         </w:tc>
       </w:tr>
       <w:tr>
-        <w:tblPrEx>
-          <w:tblCellMar>
-            <w:top w:w="0" w:type="dxa"/>
-            <w:bottom w:w="0" w:type="dxa"/>
-          </w:tblCellMar>
-        </w:tblPrEx>
         <w:tc>
           <w:tcPr>
             <w:tcW w:w="2200" w:type="dxa"/>
@@ -12067,12 +11256,6 @@
         </w:tc>
       </w:tr>
       <w:tr>
-        <w:tblPrEx>
-          <w:tblCellMar>
-            <w:top w:w="0" w:type="dxa"/>
-            <w:bottom w:w="0" w:type="dxa"/>
-          </w:tblCellMar>
-        </w:tblPrEx>
         <w:tc>
           <w:tcPr>
             <w:tcW w:w="2200" w:type="dxa"/>
@@ -12125,12 +11308,6 @@
         </w:tc>
       </w:tr>
       <w:tr>
-        <w:tblPrEx>
-          <w:tblCellMar>
-            <w:top w:w="0" w:type="dxa"/>
-            <w:bottom w:w="0" w:type="dxa"/>
-          </w:tblCellMar>
-        </w:tblPrEx>
         <w:tc>
           <w:tcPr>
             <w:tcW w:w="2200" w:type="dxa"/>
@@ -12199,12 +11376,6 @@
         </w:tc>
       </w:tr>
       <w:tr>
-        <w:tblPrEx>
-          <w:tblCellMar>
-            <w:top w:w="0" w:type="dxa"/>
-            <w:bottom w:w="0" w:type="dxa"/>
-          </w:tblCellMar>
-        </w:tblPrEx>
         <w:tc>
           <w:tcPr>
             <w:tcW w:w="2200" w:type="dxa"/>
@@ -12257,12 +11428,6 @@
         </w:tc>
       </w:tr>
       <w:tr>
-        <w:tblPrEx>
-          <w:tblCellMar>
-            <w:top w:w="0" w:type="dxa"/>
-            <w:bottom w:w="0" w:type="dxa"/>
-          </w:tblCellMar>
-        </w:tblPrEx>
         <w:tc>
           <w:tcPr>
             <w:tcW w:w="2200" w:type="dxa"/>
@@ -12355,12 +11520,6 @@
         </w:tc>
       </w:tr>
       <w:tr>
-        <w:tblPrEx>
-          <w:tblCellMar>
-            <w:top w:w="0" w:type="dxa"/>
-            <w:bottom w:w="0" w:type="dxa"/>
-          </w:tblCellMar>
-        </w:tblPrEx>
         <w:tc>
           <w:tcPr>
             <w:tcW w:w="2200" w:type="dxa"/>
@@ -12473,12 +11632,6 @@
         </w:tc>
       </w:tr>
       <w:tr>
-        <w:tblPrEx>
-          <w:tblCellMar>
-            <w:top w:w="0" w:type="dxa"/>
-            <w:bottom w:w="0" w:type="dxa"/>
-          </w:tblCellMar>
-        </w:tblPrEx>
         <w:tc>
           <w:tcPr>
             <w:tcW w:w="2200" w:type="dxa"/>
@@ -12618,12 +11771,6 @@
         </w:tc>
       </w:tr>
       <w:tr>
-        <w:tblPrEx>
-          <w:tblCellMar>
-            <w:top w:w="0" w:type="dxa"/>
-            <w:bottom w:w="0" w:type="dxa"/>
-          </w:tblCellMar>
-        </w:tblPrEx>
         <w:tc>
           <w:tcPr>
             <w:tcW w:w="2200" w:type="dxa"/>
@@ -12711,12 +11858,6 @@
         <w:gridCol w:w="7160"/>
       </w:tblGrid>
       <w:tr>
-        <w:tblPrEx>
-          <w:tblCellMar>
-            <w:top w:w="0" w:type="dxa"/>
-            <w:bottom w:w="0" w:type="dxa"/>
-          </w:tblCellMar>
-        </w:tblPrEx>
         <w:tc>
           <w:tcPr>
             <w:tcW w:w="9360" w:type="dxa"/>
@@ -12750,12 +11891,6 @@
         </w:tc>
       </w:tr>
       <w:tr>
-        <w:tblPrEx>
-          <w:tblCellMar>
-            <w:top w:w="0" w:type="dxa"/>
-            <w:bottom w:w="0" w:type="dxa"/>
-          </w:tblCellMar>
-        </w:tblPrEx>
         <w:tc>
           <w:tcPr>
             <w:tcW w:w="2200" w:type="dxa"/>
@@ -12808,12 +11943,6 @@
         </w:tc>
       </w:tr>
       <w:tr>
-        <w:tblPrEx>
-          <w:tblCellMar>
-            <w:top w:w="0" w:type="dxa"/>
-            <w:bottom w:w="0" w:type="dxa"/>
-          </w:tblCellMar>
-        </w:tblPrEx>
         <w:tc>
           <w:tcPr>
             <w:tcW w:w="2200" w:type="dxa"/>
@@ -12866,12 +11995,6 @@
         </w:tc>
       </w:tr>
       <w:tr>
-        <w:tblPrEx>
-          <w:tblCellMar>
-            <w:top w:w="0" w:type="dxa"/>
-            <w:bottom w:w="0" w:type="dxa"/>
-          </w:tblCellMar>
-        </w:tblPrEx>
         <w:tc>
           <w:tcPr>
             <w:tcW w:w="2200" w:type="dxa"/>
@@ -12924,12 +12047,6 @@
         </w:tc>
       </w:tr>
       <w:tr>
-        <w:tblPrEx>
-          <w:tblCellMar>
-            <w:top w:w="0" w:type="dxa"/>
-            <w:bottom w:w="0" w:type="dxa"/>
-          </w:tblCellMar>
-        </w:tblPrEx>
         <w:tc>
           <w:tcPr>
             <w:tcW w:w="2200" w:type="dxa"/>
@@ -12982,12 +12099,6 @@
         </w:tc>
       </w:tr>
       <w:tr>
-        <w:tblPrEx>
-          <w:tblCellMar>
-            <w:top w:w="0" w:type="dxa"/>
-            <w:bottom w:w="0" w:type="dxa"/>
-          </w:tblCellMar>
-        </w:tblPrEx>
         <w:tc>
           <w:tcPr>
             <w:tcW w:w="2200" w:type="dxa"/>
@@ -13071,12 +12182,6 @@
         </w:tc>
       </w:tr>
       <w:tr>
-        <w:tblPrEx>
-          <w:tblCellMar>
-            <w:top w:w="0" w:type="dxa"/>
-            <w:bottom w:w="0" w:type="dxa"/>
-          </w:tblCellMar>
-        </w:tblPrEx>
         <w:tc>
           <w:tcPr>
             <w:tcW w:w="2200" w:type="dxa"/>
@@ -13188,12 +12293,6 @@
         </w:tc>
       </w:tr>
       <w:tr>
-        <w:tblPrEx>
-          <w:tblCellMar>
-            <w:top w:w="0" w:type="dxa"/>
-            <w:bottom w:w="0" w:type="dxa"/>
-          </w:tblCellMar>
-        </w:tblPrEx>
         <w:tc>
           <w:tcPr>
             <w:tcW w:w="2200" w:type="dxa"/>
@@ -13302,12 +12401,6 @@
         </w:tc>
       </w:tr>
       <w:tr>
-        <w:tblPrEx>
-          <w:tblCellMar>
-            <w:top w:w="0" w:type="dxa"/>
-            <w:bottom w:w="0" w:type="dxa"/>
-          </w:tblCellMar>
-        </w:tblPrEx>
         <w:tc>
           <w:tcPr>
             <w:tcW w:w="2200" w:type="dxa"/>
@@ -13421,12 +12514,6 @@
         <w:gridCol w:w="7160"/>
       </w:tblGrid>
       <w:tr>
-        <w:tblPrEx>
-          <w:tblCellMar>
-            <w:top w:w="0" w:type="dxa"/>
-            <w:bottom w:w="0" w:type="dxa"/>
-          </w:tblCellMar>
-        </w:tblPrEx>
         <w:tc>
           <w:tcPr>
             <w:tcW w:w="9360" w:type="dxa"/>
@@ -13476,12 +12563,6 @@
         </w:tc>
       </w:tr>
       <w:tr>
-        <w:tblPrEx>
-          <w:tblCellMar>
-            <w:top w:w="0" w:type="dxa"/>
-            <w:bottom w:w="0" w:type="dxa"/>
-          </w:tblCellMar>
-        </w:tblPrEx>
         <w:tc>
           <w:tcPr>
             <w:tcW w:w="2200" w:type="dxa"/>
@@ -13534,12 +12615,6 @@
         </w:tc>
       </w:tr>
       <w:tr>
-        <w:tblPrEx>
-          <w:tblCellMar>
-            <w:top w:w="0" w:type="dxa"/>
-            <w:bottom w:w="0" w:type="dxa"/>
-          </w:tblCellMar>
-        </w:tblPrEx>
         <w:tc>
           <w:tcPr>
             <w:tcW w:w="2200" w:type="dxa"/>
@@ -13597,12 +12672,6 @@
         </w:tc>
       </w:tr>
       <w:tr>
-        <w:tblPrEx>
-          <w:tblCellMar>
-            <w:top w:w="0" w:type="dxa"/>
-            <w:bottom w:w="0" w:type="dxa"/>
-          </w:tblCellMar>
-        </w:tblPrEx>
         <w:tc>
           <w:tcPr>
             <w:tcW w:w="2200" w:type="dxa"/>
@@ -13663,12 +12732,6 @@
         </w:tc>
       </w:tr>
       <w:tr>
-        <w:tblPrEx>
-          <w:tblCellMar>
-            <w:top w:w="0" w:type="dxa"/>
-            <w:bottom w:w="0" w:type="dxa"/>
-          </w:tblCellMar>
-        </w:tblPrEx>
         <w:tc>
           <w:tcPr>
             <w:tcW w:w="2200" w:type="dxa"/>
@@ -13721,12 +12784,6 @@
         </w:tc>
       </w:tr>
       <w:tr>
-        <w:tblPrEx>
-          <w:tblCellMar>
-            <w:top w:w="0" w:type="dxa"/>
-            <w:bottom w:w="0" w:type="dxa"/>
-          </w:tblCellMar>
-        </w:tblPrEx>
         <w:tc>
           <w:tcPr>
             <w:tcW w:w="2200" w:type="dxa"/>
@@ -13830,12 +12887,6 @@
         </w:tc>
       </w:tr>
       <w:tr>
-        <w:tblPrEx>
-          <w:tblCellMar>
-            <w:top w:w="0" w:type="dxa"/>
-            <w:bottom w:w="0" w:type="dxa"/>
-          </w:tblCellMar>
-        </w:tblPrEx>
         <w:tc>
           <w:tcPr>
             <w:tcW w:w="2200" w:type="dxa"/>
@@ -13949,12 +13000,6 @@
         </w:tc>
       </w:tr>
       <w:tr>
-        <w:tblPrEx>
-          <w:tblCellMar>
-            <w:top w:w="0" w:type="dxa"/>
-            <w:bottom w:w="0" w:type="dxa"/>
-          </w:tblCellMar>
-        </w:tblPrEx>
         <w:tc>
           <w:tcPr>
             <w:tcW w:w="2200" w:type="dxa"/>
@@ -14062,12 +13107,6 @@
         </w:tc>
       </w:tr>
       <w:tr>
-        <w:tblPrEx>
-          <w:tblCellMar>
-            <w:top w:w="0" w:type="dxa"/>
-            <w:bottom w:w="0" w:type="dxa"/>
-          </w:tblCellMar>
-        </w:tblPrEx>
         <w:tc>
           <w:tcPr>
             <w:tcW w:w="2200" w:type="dxa"/>
@@ -14155,12 +13194,6 @@
         <w:gridCol w:w="7160"/>
       </w:tblGrid>
       <w:tr>
-        <w:tblPrEx>
-          <w:tblCellMar>
-            <w:top w:w="0" w:type="dxa"/>
-            <w:bottom w:w="0" w:type="dxa"/>
-          </w:tblCellMar>
-        </w:tblPrEx>
         <w:tc>
           <w:tcPr>
             <w:tcW w:w="9360" w:type="dxa"/>
@@ -14194,12 +13227,6 @@
         </w:tc>
       </w:tr>
       <w:tr>
-        <w:tblPrEx>
-          <w:tblCellMar>
-            <w:top w:w="0" w:type="dxa"/>
-            <w:bottom w:w="0" w:type="dxa"/>
-          </w:tblCellMar>
-        </w:tblPrEx>
         <w:tc>
           <w:tcPr>
             <w:tcW w:w="2200" w:type="dxa"/>
@@ -14253,12 +13280,6 @@
         </w:tc>
       </w:tr>
       <w:tr>
-        <w:tblPrEx>
-          <w:tblCellMar>
-            <w:top w:w="0" w:type="dxa"/>
-            <w:bottom w:w="0" w:type="dxa"/>
-          </w:tblCellMar>
-        </w:tblPrEx>
         <w:tc>
           <w:tcPr>
             <w:tcW w:w="2200" w:type="dxa"/>
@@ -14311,12 +13332,6 @@
         </w:tc>
       </w:tr>
       <w:tr>
-        <w:tblPrEx>
-          <w:tblCellMar>
-            <w:top w:w="0" w:type="dxa"/>
-            <w:bottom w:w="0" w:type="dxa"/>
-          </w:tblCellMar>
-        </w:tblPrEx>
         <w:tc>
           <w:tcPr>
             <w:tcW w:w="2200" w:type="dxa"/>
@@ -14377,12 +13392,6 @@
         </w:tc>
       </w:tr>
       <w:tr>
-        <w:tblPrEx>
-          <w:tblCellMar>
-            <w:top w:w="0" w:type="dxa"/>
-            <w:bottom w:w="0" w:type="dxa"/>
-          </w:tblCellMar>
-        </w:tblPrEx>
         <w:tc>
           <w:tcPr>
             <w:tcW w:w="2200" w:type="dxa"/>
@@ -14435,12 +13444,6 @@
         </w:tc>
       </w:tr>
       <w:tr>
-        <w:tblPrEx>
-          <w:tblCellMar>
-            <w:top w:w="0" w:type="dxa"/>
-            <w:bottom w:w="0" w:type="dxa"/>
-          </w:tblCellMar>
-        </w:tblPrEx>
         <w:tc>
           <w:tcPr>
             <w:tcW w:w="2200" w:type="dxa"/>
@@ -14532,12 +13535,6 @@
         </w:tc>
       </w:tr>
       <w:tr>
-        <w:tblPrEx>
-          <w:tblCellMar>
-            <w:top w:w="0" w:type="dxa"/>
-            <w:bottom w:w="0" w:type="dxa"/>
-          </w:tblCellMar>
-        </w:tblPrEx>
         <w:tc>
           <w:tcPr>
             <w:tcW w:w="2200" w:type="dxa"/>
@@ -14633,12 +13630,6 @@
         </w:tc>
       </w:tr>
       <w:tr>
-        <w:tblPrEx>
-          <w:tblCellMar>
-            <w:top w:w="0" w:type="dxa"/>
-            <w:bottom w:w="0" w:type="dxa"/>
-          </w:tblCellMar>
-        </w:tblPrEx>
         <w:tc>
           <w:tcPr>
             <w:tcW w:w="2200" w:type="dxa"/>
@@ -14746,12 +13737,6 @@
         </w:tc>
       </w:tr>
       <w:tr>
-        <w:tblPrEx>
-          <w:tblCellMar>
-            <w:top w:w="0" w:type="dxa"/>
-            <w:bottom w:w="0" w:type="dxa"/>
-          </w:tblCellMar>
-        </w:tblPrEx>
         <w:tc>
           <w:tcPr>
             <w:tcW w:w="2200" w:type="dxa"/>
@@ -14831,12 +13816,6 @@
         <w:gridCol w:w="7160"/>
       </w:tblGrid>
       <w:tr>
-        <w:tblPrEx>
-          <w:tblCellMar>
-            <w:top w:w="0" w:type="dxa"/>
-            <w:bottom w:w="0" w:type="dxa"/>
-          </w:tblCellMar>
-        </w:tblPrEx>
         <w:tc>
           <w:tcPr>
             <w:tcW w:w="9360" w:type="dxa"/>
@@ -14870,12 +13849,6 @@
         </w:tc>
       </w:tr>
       <w:tr>
-        <w:tblPrEx>
-          <w:tblCellMar>
-            <w:top w:w="0" w:type="dxa"/>
-            <w:bottom w:w="0" w:type="dxa"/>
-          </w:tblCellMar>
-        </w:tblPrEx>
         <w:tc>
           <w:tcPr>
             <w:tcW w:w="2200" w:type="dxa"/>
@@ -14928,12 +13901,6 @@
         </w:tc>
       </w:tr>
       <w:tr>
-        <w:tblPrEx>
-          <w:tblCellMar>
-            <w:top w:w="0" w:type="dxa"/>
-            <w:bottom w:w="0" w:type="dxa"/>
-          </w:tblCellMar>
-        </w:tblPrEx>
         <w:tc>
           <w:tcPr>
             <w:tcW w:w="2200" w:type="dxa"/>
@@ -14986,12 +13953,6 @@
         </w:tc>
       </w:tr>
       <w:tr>
-        <w:tblPrEx>
-          <w:tblCellMar>
-            <w:top w:w="0" w:type="dxa"/>
-            <w:bottom w:w="0" w:type="dxa"/>
-          </w:tblCellMar>
-        </w:tblPrEx>
         <w:tc>
           <w:tcPr>
             <w:tcW w:w="2200" w:type="dxa"/>
@@ -15044,12 +14005,6 @@
         </w:tc>
       </w:tr>
       <w:tr>
-        <w:tblPrEx>
-          <w:tblCellMar>
-            <w:top w:w="0" w:type="dxa"/>
-            <w:bottom w:w="0" w:type="dxa"/>
-          </w:tblCellMar>
-        </w:tblPrEx>
         <w:tc>
           <w:tcPr>
             <w:tcW w:w="2200" w:type="dxa"/>
@@ -15102,12 +14057,6 @@
         </w:tc>
       </w:tr>
       <w:tr>
-        <w:tblPrEx>
-          <w:tblCellMar>
-            <w:top w:w="0" w:type="dxa"/>
-            <w:bottom w:w="0" w:type="dxa"/>
-          </w:tblCellMar>
-        </w:tblPrEx>
         <w:tc>
           <w:tcPr>
             <w:tcW w:w="2200" w:type="dxa"/>
@@ -15199,12 +14148,6 @@
         </w:tc>
       </w:tr>
       <w:tr>
-        <w:tblPrEx>
-          <w:tblCellMar>
-            <w:top w:w="0" w:type="dxa"/>
-            <w:bottom w:w="0" w:type="dxa"/>
-          </w:tblCellMar>
-        </w:tblPrEx>
         <w:tc>
           <w:tcPr>
             <w:tcW w:w="2200" w:type="dxa"/>
@@ -15301,12 +14244,6 @@
         </w:tc>
       </w:tr>
       <w:tr>
-        <w:tblPrEx>
-          <w:tblCellMar>
-            <w:top w:w="0" w:type="dxa"/>
-            <w:bottom w:w="0" w:type="dxa"/>
-          </w:tblCellMar>
-        </w:tblPrEx>
         <w:tc>
           <w:tcPr>
             <w:tcW w:w="2200" w:type="dxa"/>
@@ -15415,12 +14352,6 @@
         </w:tc>
       </w:tr>
       <w:tr>
-        <w:tblPrEx>
-          <w:tblCellMar>
-            <w:top w:w="0" w:type="dxa"/>
-            <w:bottom w:w="0" w:type="dxa"/>
-          </w:tblCellMar>
-        </w:tblPrEx>
         <w:tc>
           <w:tcPr>
             <w:tcW w:w="2200" w:type="dxa"/>
@@ -15500,12 +14431,6 @@
         <w:gridCol w:w="7160"/>
       </w:tblGrid>
       <w:tr>
-        <w:tblPrEx>
-          <w:tblCellMar>
-            <w:top w:w="0" w:type="dxa"/>
-            <w:bottom w:w="0" w:type="dxa"/>
-          </w:tblCellMar>
-        </w:tblPrEx>
         <w:tc>
           <w:tcPr>
             <w:tcW w:w="9360" w:type="dxa"/>
@@ -15539,12 +14464,6 @@
         </w:tc>
       </w:tr>
       <w:tr>
-        <w:tblPrEx>
-          <w:tblCellMar>
-            <w:top w:w="0" w:type="dxa"/>
-            <w:bottom w:w="0" w:type="dxa"/>
-          </w:tblCellMar>
-        </w:tblPrEx>
         <w:tc>
           <w:tcPr>
             <w:tcW w:w="2200" w:type="dxa"/>
@@ -15597,12 +14516,6 @@
         </w:tc>
       </w:tr>
       <w:tr>
-        <w:tblPrEx>
-          <w:tblCellMar>
-            <w:top w:w="0" w:type="dxa"/>
-            <w:bottom w:w="0" w:type="dxa"/>
-          </w:tblCellMar>
-        </w:tblPrEx>
         <w:tc>
           <w:tcPr>
             <w:tcW w:w="2200" w:type="dxa"/>
@@ -15655,12 +14568,6 @@
         </w:tc>
       </w:tr>
       <w:tr>
-        <w:tblPrEx>
-          <w:tblCellMar>
-            <w:top w:w="0" w:type="dxa"/>
-            <w:bottom w:w="0" w:type="dxa"/>
-          </w:tblCellMar>
-        </w:tblPrEx>
         <w:tc>
           <w:tcPr>
             <w:tcW w:w="2200" w:type="dxa"/>
@@ -15713,12 +14620,6 @@
         </w:tc>
       </w:tr>
       <w:tr>
-        <w:tblPrEx>
-          <w:tblCellMar>
-            <w:top w:w="0" w:type="dxa"/>
-            <w:bottom w:w="0" w:type="dxa"/>
-          </w:tblCellMar>
-        </w:tblPrEx>
         <w:tc>
           <w:tcPr>
             <w:tcW w:w="2200" w:type="dxa"/>
@@ -15771,12 +14672,6 @@
         </w:tc>
       </w:tr>
       <w:tr>
-        <w:tblPrEx>
-          <w:tblCellMar>
-            <w:top w:w="0" w:type="dxa"/>
-            <w:bottom w:w="0" w:type="dxa"/>
-          </w:tblCellMar>
-        </w:tblPrEx>
         <w:tc>
           <w:tcPr>
             <w:tcW w:w="2200" w:type="dxa"/>
@@ -15860,12 +14755,6 @@
         </w:tc>
       </w:tr>
       <w:tr>
-        <w:tblPrEx>
-          <w:tblCellMar>
-            <w:top w:w="0" w:type="dxa"/>
-            <w:bottom w:w="0" w:type="dxa"/>
-          </w:tblCellMar>
-        </w:tblPrEx>
         <w:tc>
           <w:tcPr>
             <w:tcW w:w="2200" w:type="dxa"/>
@@ -15961,12 +14850,6 @@
         </w:tc>
       </w:tr>
       <w:tr>
-        <w:tblPrEx>
-          <w:tblCellMar>
-            <w:top w:w="0" w:type="dxa"/>
-            <w:bottom w:w="0" w:type="dxa"/>
-          </w:tblCellMar>
-        </w:tblPrEx>
         <w:tc>
           <w:tcPr>
             <w:tcW w:w="2200" w:type="dxa"/>
@@ -16074,12 +14957,6 @@
         </w:tc>
       </w:tr>
       <w:tr>
-        <w:tblPrEx>
-          <w:tblCellMar>
-            <w:top w:w="0" w:type="dxa"/>
-            <w:bottom w:w="0" w:type="dxa"/>
-          </w:tblCellMar>
-        </w:tblPrEx>
         <w:tc>
           <w:tcPr>
             <w:tcW w:w="2200" w:type="dxa"/>
@@ -16178,12 +15055,6 @@
         <w:gridCol w:w="7160"/>
       </w:tblGrid>
       <w:tr>
-        <w:tblPrEx>
-          <w:tblCellMar>
-            <w:top w:w="0" w:type="dxa"/>
-            <w:bottom w:w="0" w:type="dxa"/>
-          </w:tblCellMar>
-        </w:tblPrEx>
         <w:tc>
           <w:tcPr>
             <w:tcW w:w="9360" w:type="dxa"/>
@@ -16217,12 +15088,6 @@
         </w:tc>
       </w:tr>
       <w:tr>
-        <w:tblPrEx>
-          <w:tblCellMar>
-            <w:top w:w="0" w:type="dxa"/>
-            <w:bottom w:w="0" w:type="dxa"/>
-          </w:tblCellMar>
-        </w:tblPrEx>
         <w:tc>
           <w:tcPr>
             <w:tcW w:w="2200" w:type="dxa"/>
@@ -16275,12 +15140,6 @@
         </w:tc>
       </w:tr>
       <w:tr>
-        <w:tblPrEx>
-          <w:tblCellMar>
-            <w:top w:w="0" w:type="dxa"/>
-            <w:bottom w:w="0" w:type="dxa"/>
-          </w:tblCellMar>
-        </w:tblPrEx>
         <w:tc>
           <w:tcPr>
             <w:tcW w:w="2200" w:type="dxa"/>
@@ -16333,12 +15192,6 @@
         </w:tc>
       </w:tr>
       <w:tr>
-        <w:tblPrEx>
-          <w:tblCellMar>
-            <w:top w:w="0" w:type="dxa"/>
-            <w:bottom w:w="0" w:type="dxa"/>
-          </w:tblCellMar>
-        </w:tblPrEx>
         <w:tc>
           <w:tcPr>
             <w:tcW w:w="2200" w:type="dxa"/>
@@ -16399,12 +15252,6 @@
         </w:tc>
       </w:tr>
       <w:tr>
-        <w:tblPrEx>
-          <w:tblCellMar>
-            <w:top w:w="0" w:type="dxa"/>
-            <w:bottom w:w="0" w:type="dxa"/>
-          </w:tblCellMar>
-        </w:tblPrEx>
         <w:tc>
           <w:tcPr>
             <w:tcW w:w="2200" w:type="dxa"/>
@@ -16457,12 +15304,6 @@
         </w:tc>
       </w:tr>
       <w:tr>
-        <w:tblPrEx>
-          <w:tblCellMar>
-            <w:top w:w="0" w:type="dxa"/>
-            <w:bottom w:w="0" w:type="dxa"/>
-          </w:tblCellMar>
-        </w:tblPrEx>
         <w:tc>
           <w:tcPr>
             <w:tcW w:w="2200" w:type="dxa"/>
@@ -16546,12 +15387,6 @@
         </w:tc>
       </w:tr>
       <w:tr>
-        <w:tblPrEx>
-          <w:tblCellMar>
-            <w:top w:w="0" w:type="dxa"/>
-            <w:bottom w:w="0" w:type="dxa"/>
-          </w:tblCellMar>
-        </w:tblPrEx>
         <w:tc>
           <w:tcPr>
             <w:tcW w:w="2200" w:type="dxa"/>
@@ -16647,12 +15482,6 @@
         </w:tc>
       </w:tr>
       <w:tr>
-        <w:tblPrEx>
-          <w:tblCellMar>
-            <w:top w:w="0" w:type="dxa"/>
-            <w:bottom w:w="0" w:type="dxa"/>
-          </w:tblCellMar>
-        </w:tblPrEx>
         <w:tc>
           <w:tcPr>
             <w:tcW w:w="2200" w:type="dxa"/>
@@ -16760,12 +15589,6 @@
         </w:tc>
       </w:tr>
       <w:tr>
-        <w:tblPrEx>
-          <w:tblCellMar>
-            <w:top w:w="0" w:type="dxa"/>
-            <w:bottom w:w="0" w:type="dxa"/>
-          </w:tblCellMar>
-        </w:tblPrEx>
         <w:tc>
           <w:tcPr>
             <w:tcW w:w="2200" w:type="dxa"/>
@@ -16845,12 +15668,6 @@
         <w:gridCol w:w="7160"/>
       </w:tblGrid>
       <w:tr>
-        <w:tblPrEx>
-          <w:tblCellMar>
-            <w:top w:w="0" w:type="dxa"/>
-            <w:bottom w:w="0" w:type="dxa"/>
-          </w:tblCellMar>
-        </w:tblPrEx>
         <w:tc>
           <w:tcPr>
             <w:tcW w:w="9360" w:type="dxa"/>
@@ -16884,12 +15701,6 @@
         </w:tc>
       </w:tr>
       <w:tr>
-        <w:tblPrEx>
-          <w:tblCellMar>
-            <w:top w:w="0" w:type="dxa"/>
-            <w:bottom w:w="0" w:type="dxa"/>
-          </w:tblCellMar>
-        </w:tblPrEx>
         <w:tc>
           <w:tcPr>
             <w:tcW w:w="2200" w:type="dxa"/>
@@ -16942,12 +15753,6 @@
         </w:tc>
       </w:tr>
       <w:tr>
-        <w:tblPrEx>
-          <w:tblCellMar>
-            <w:top w:w="0" w:type="dxa"/>
-            <w:bottom w:w="0" w:type="dxa"/>
-          </w:tblCellMar>
-        </w:tblPrEx>
         <w:tc>
           <w:tcPr>
             <w:tcW w:w="2200" w:type="dxa"/>
@@ -17000,12 +15805,6 @@
         </w:tc>
       </w:tr>
       <w:tr>
-        <w:tblPrEx>
-          <w:tblCellMar>
-            <w:top w:w="0" w:type="dxa"/>
-            <w:bottom w:w="0" w:type="dxa"/>
-          </w:tblCellMar>
-        </w:tblPrEx>
         <w:tc>
           <w:tcPr>
             <w:tcW w:w="2200" w:type="dxa"/>
@@ -17078,12 +15877,6 @@
         </w:tc>
       </w:tr>
       <w:tr>
-        <w:tblPrEx>
-          <w:tblCellMar>
-            <w:top w:w="0" w:type="dxa"/>
-            <w:bottom w:w="0" w:type="dxa"/>
-          </w:tblCellMar>
-        </w:tblPrEx>
         <w:tc>
           <w:tcPr>
             <w:tcW w:w="2200" w:type="dxa"/>
@@ -17137,12 +15930,6 @@
         </w:tc>
       </w:tr>
       <w:tr>
-        <w:tblPrEx>
-          <w:tblCellMar>
-            <w:top w:w="0" w:type="dxa"/>
-            <w:bottom w:w="0" w:type="dxa"/>
-          </w:tblCellMar>
-        </w:tblPrEx>
         <w:tc>
           <w:tcPr>
             <w:tcW w:w="2200" w:type="dxa"/>
@@ -17226,12 +16013,6 @@
         </w:tc>
       </w:tr>
       <w:tr>
-        <w:tblPrEx>
-          <w:tblCellMar>
-            <w:top w:w="0" w:type="dxa"/>
-            <w:bottom w:w="0" w:type="dxa"/>
-          </w:tblCellMar>
-        </w:tblPrEx>
         <w:tc>
           <w:tcPr>
             <w:tcW w:w="2200" w:type="dxa"/>
@@ -17335,12 +16116,6 @@
         </w:tc>
       </w:tr>
       <w:tr>
-        <w:tblPrEx>
-          <w:tblCellMar>
-            <w:top w:w="0" w:type="dxa"/>
-            <w:bottom w:w="0" w:type="dxa"/>
-          </w:tblCellMar>
-        </w:tblPrEx>
         <w:tc>
           <w:tcPr>
             <w:tcW w:w="2200" w:type="dxa"/>
@@ -17456,12 +16231,6 @@
         </w:tc>
       </w:tr>
       <w:tr>
-        <w:tblPrEx>
-          <w:tblCellMar>
-            <w:top w:w="0" w:type="dxa"/>
-            <w:bottom w:w="0" w:type="dxa"/>
-          </w:tblCellMar>
-        </w:tblPrEx>
         <w:tc>
           <w:tcPr>
             <w:tcW w:w="2200" w:type="dxa"/>
@@ -17541,12 +16310,6 @@
         <w:gridCol w:w="7160"/>
       </w:tblGrid>
       <w:tr>
-        <w:tblPrEx>
-          <w:tblCellMar>
-            <w:top w:w="0" w:type="dxa"/>
-            <w:bottom w:w="0" w:type="dxa"/>
-          </w:tblCellMar>
-        </w:tblPrEx>
         <w:tc>
           <w:tcPr>
             <w:tcW w:w="9360" w:type="dxa"/>
@@ -17580,12 +16343,6 @@
         </w:tc>
       </w:tr>
       <w:tr>
-        <w:tblPrEx>
-          <w:tblCellMar>
-            <w:top w:w="0" w:type="dxa"/>
-            <w:bottom w:w="0" w:type="dxa"/>
-          </w:tblCellMar>
-        </w:tblPrEx>
         <w:tc>
           <w:tcPr>
             <w:tcW w:w="2200" w:type="dxa"/>
@@ -17638,12 +16395,6 @@
         </w:tc>
       </w:tr>
       <w:tr>
-        <w:tblPrEx>
-          <w:tblCellMar>
-            <w:top w:w="0" w:type="dxa"/>
-            <w:bottom w:w="0" w:type="dxa"/>
-          </w:tblCellMar>
-        </w:tblPrEx>
         <w:tc>
           <w:tcPr>
             <w:tcW w:w="2200" w:type="dxa"/>
@@ -17696,12 +16447,6 @@
         </w:tc>
       </w:tr>
       <w:tr>
-        <w:tblPrEx>
-          <w:tblCellMar>
-            <w:top w:w="0" w:type="dxa"/>
-            <w:bottom w:w="0" w:type="dxa"/>
-          </w:tblCellMar>
-        </w:tblPrEx>
         <w:tc>
           <w:tcPr>
             <w:tcW w:w="2200" w:type="dxa"/>
@@ -17762,12 +16507,6 @@
         </w:tc>
       </w:tr>
       <w:tr>
-        <w:tblPrEx>
-          <w:tblCellMar>
-            <w:top w:w="0" w:type="dxa"/>
-            <w:bottom w:w="0" w:type="dxa"/>
-          </w:tblCellMar>
-        </w:tblPrEx>
         <w:tc>
           <w:tcPr>
             <w:tcW w:w="2200" w:type="dxa"/>
@@ -17820,12 +16559,6 @@
         </w:tc>
       </w:tr>
       <w:tr>
-        <w:tblPrEx>
-          <w:tblCellMar>
-            <w:top w:w="0" w:type="dxa"/>
-            <w:bottom w:w="0" w:type="dxa"/>
-          </w:tblCellMar>
-        </w:tblPrEx>
         <w:tc>
           <w:tcPr>
             <w:tcW w:w="2200" w:type="dxa"/>
@@ -17909,12 +16642,6 @@
         </w:tc>
       </w:tr>
       <w:tr>
-        <w:tblPrEx>
-          <w:tblCellMar>
-            <w:top w:w="0" w:type="dxa"/>
-            <w:bottom w:w="0" w:type="dxa"/>
-          </w:tblCellMar>
-        </w:tblPrEx>
         <w:tc>
           <w:tcPr>
             <w:tcW w:w="2200" w:type="dxa"/>
@@ -18015,12 +16742,6 @@
         </w:tc>
       </w:tr>
       <w:tr>
-        <w:tblPrEx>
-          <w:tblCellMar>
-            <w:top w:w="0" w:type="dxa"/>
-            <w:bottom w:w="0" w:type="dxa"/>
-          </w:tblCellMar>
-        </w:tblPrEx>
         <w:tc>
           <w:tcPr>
             <w:tcW w:w="2200" w:type="dxa"/>
@@ -18137,12 +16858,6 @@
         </w:tc>
       </w:tr>
       <w:tr>
-        <w:tblPrEx>
-          <w:tblCellMar>
-            <w:top w:w="0" w:type="dxa"/>
-            <w:bottom w:w="0" w:type="dxa"/>
-          </w:tblCellMar>
-        </w:tblPrEx>
         <w:tc>
           <w:tcPr>
             <w:tcW w:w="2200" w:type="dxa"/>
@@ -18222,12 +16937,6 @@
         <w:gridCol w:w="7160"/>
       </w:tblGrid>
       <w:tr>
-        <w:tblPrEx>
-          <w:tblCellMar>
-            <w:top w:w="0" w:type="dxa"/>
-            <w:bottom w:w="0" w:type="dxa"/>
-          </w:tblCellMar>
-        </w:tblPrEx>
         <w:tc>
           <w:tcPr>
             <w:tcW w:w="9360" w:type="dxa"/>
@@ -18261,12 +16970,6 @@
         </w:tc>
       </w:tr>
       <w:tr>
-        <w:tblPrEx>
-          <w:tblCellMar>
-            <w:top w:w="0" w:type="dxa"/>
-            <w:bottom w:w="0" w:type="dxa"/>
-          </w:tblCellMar>
-        </w:tblPrEx>
         <w:tc>
           <w:tcPr>
             <w:tcW w:w="2200" w:type="dxa"/>
@@ -18319,12 +17022,6 @@
         </w:tc>
       </w:tr>
       <w:tr>
-        <w:tblPrEx>
-          <w:tblCellMar>
-            <w:top w:w="0" w:type="dxa"/>
-            <w:bottom w:w="0" w:type="dxa"/>
-          </w:tblCellMar>
-        </w:tblPrEx>
         <w:tc>
           <w:tcPr>
             <w:tcW w:w="2200" w:type="dxa"/>
@@ -18377,12 +17074,6 @@
         </w:tc>
       </w:tr>
       <w:tr>
-        <w:tblPrEx>
-          <w:tblCellMar>
-            <w:top w:w="0" w:type="dxa"/>
-            <w:bottom w:w="0" w:type="dxa"/>
-          </w:tblCellMar>
-        </w:tblPrEx>
         <w:tc>
           <w:tcPr>
             <w:tcW w:w="2200" w:type="dxa"/>
@@ -18451,12 +17142,6 @@
         </w:tc>
       </w:tr>
       <w:tr>
-        <w:tblPrEx>
-          <w:tblCellMar>
-            <w:top w:w="0" w:type="dxa"/>
-            <w:bottom w:w="0" w:type="dxa"/>
-          </w:tblCellMar>
-        </w:tblPrEx>
         <w:tc>
           <w:tcPr>
             <w:tcW w:w="2200" w:type="dxa"/>
@@ -18509,12 +17194,6 @@
         </w:tc>
       </w:tr>
       <w:tr>
-        <w:tblPrEx>
-          <w:tblCellMar>
-            <w:top w:w="0" w:type="dxa"/>
-            <w:bottom w:w="0" w:type="dxa"/>
-          </w:tblCellMar>
-        </w:tblPrEx>
         <w:tc>
           <w:tcPr>
             <w:tcW w:w="2200" w:type="dxa"/>
@@ -18598,12 +17277,6 @@
         </w:tc>
       </w:tr>
       <w:tr>
-        <w:tblPrEx>
-          <w:tblCellMar>
-            <w:top w:w="0" w:type="dxa"/>
-            <w:bottom w:w="0" w:type="dxa"/>
-          </w:tblCellMar>
-        </w:tblPrEx>
         <w:tc>
           <w:tcPr>
             <w:tcW w:w="2200" w:type="dxa"/>
@@ -18699,12 +17372,6 @@
         </w:tc>
       </w:tr>
       <w:tr>
-        <w:tblPrEx>
-          <w:tblCellMar>
-            <w:top w:w="0" w:type="dxa"/>
-            <w:bottom w:w="0" w:type="dxa"/>
-          </w:tblCellMar>
-        </w:tblPrEx>
         <w:tc>
           <w:tcPr>
             <w:tcW w:w="2200" w:type="dxa"/>
@@ -18812,12 +17479,6 @@
         </w:tc>
       </w:tr>
       <w:tr>
-        <w:tblPrEx>
-          <w:tblCellMar>
-            <w:top w:w="0" w:type="dxa"/>
-            <w:bottom w:w="0" w:type="dxa"/>
-          </w:tblCellMar>
-        </w:tblPrEx>
         <w:tc>
           <w:tcPr>
             <w:tcW w:w="2200" w:type="dxa"/>
@@ -18922,12 +17583,6 @@
         <w:gridCol w:w="7160"/>
       </w:tblGrid>
       <w:tr>
-        <w:tblPrEx>
-          <w:tblCellMar>
-            <w:top w:w="0" w:type="dxa"/>
-            <w:bottom w:w="0" w:type="dxa"/>
-          </w:tblCellMar>
-        </w:tblPrEx>
         <w:tc>
           <w:tcPr>
             <w:tcW w:w="9360" w:type="dxa"/>
@@ -18961,12 +17616,6 @@
         </w:tc>
       </w:tr>
       <w:tr>
-        <w:tblPrEx>
-          <w:tblCellMar>
-            <w:top w:w="0" w:type="dxa"/>
-            <w:bottom w:w="0" w:type="dxa"/>
-          </w:tblCellMar>
-        </w:tblPrEx>
         <w:tc>
           <w:tcPr>
             <w:tcW w:w="2200" w:type="dxa"/>
@@ -19019,12 +17668,6 @@
         </w:tc>
       </w:tr>
       <w:tr>
-        <w:tblPrEx>
-          <w:tblCellMar>
-            <w:top w:w="0" w:type="dxa"/>
-            <w:bottom w:w="0" w:type="dxa"/>
-          </w:tblCellMar>
-        </w:tblPrEx>
         <w:tc>
           <w:tcPr>
             <w:tcW w:w="2200" w:type="dxa"/>
@@ -19077,12 +17720,6 @@
         </w:tc>
       </w:tr>
       <w:tr>
-        <w:tblPrEx>
-          <w:tblCellMar>
-            <w:top w:w="0" w:type="dxa"/>
-            <w:bottom w:w="0" w:type="dxa"/>
-          </w:tblCellMar>
-        </w:tblPrEx>
         <w:tc>
           <w:tcPr>
             <w:tcW w:w="2200" w:type="dxa"/>
@@ -19135,12 +17772,6 @@
         </w:tc>
       </w:tr>
       <w:tr>
-        <w:tblPrEx>
-          <w:tblCellMar>
-            <w:top w:w="0" w:type="dxa"/>
-            <w:bottom w:w="0" w:type="dxa"/>
-          </w:tblCellMar>
-        </w:tblPrEx>
         <w:tc>
           <w:tcPr>
             <w:tcW w:w="2200" w:type="dxa"/>
@@ -19248,12 +17879,6 @@
         </w:tc>
       </w:tr>
       <w:tr>
-        <w:tblPrEx>
-          <w:tblCellMar>
-            <w:top w:w="0" w:type="dxa"/>
-            <w:bottom w:w="0" w:type="dxa"/>
-          </w:tblCellMar>
-        </w:tblPrEx>
         <w:tc>
           <w:tcPr>
             <w:tcW w:w="2200" w:type="dxa"/>
@@ -19344,12 +17969,6 @@
         <w:gridCol w:w="7160"/>
       </w:tblGrid>
       <w:tr>
-        <w:tblPrEx>
-          <w:tblCellMar>
-            <w:top w:w="0" w:type="dxa"/>
-            <w:bottom w:w="0" w:type="dxa"/>
-          </w:tblCellMar>
-        </w:tblPrEx>
         <w:tc>
           <w:tcPr>
             <w:tcW w:w="9360" w:type="dxa"/>
@@ -19383,12 +18002,6 @@
         </w:tc>
       </w:tr>
       <w:tr>
-        <w:tblPrEx>
-          <w:tblCellMar>
-            <w:top w:w="0" w:type="dxa"/>
-            <w:bottom w:w="0" w:type="dxa"/>
-          </w:tblCellMar>
-        </w:tblPrEx>
         <w:tc>
           <w:tcPr>
             <w:tcW w:w="2200" w:type="dxa"/>
@@ -19441,12 +18054,6 @@
         </w:tc>
       </w:tr>
       <w:tr>
-        <w:tblPrEx>
-          <w:tblCellMar>
-            <w:top w:w="0" w:type="dxa"/>
-            <w:bottom w:w="0" w:type="dxa"/>
-          </w:tblCellMar>
-        </w:tblPrEx>
         <w:tc>
           <w:tcPr>
             <w:tcW w:w="2200" w:type="dxa"/>
@@ -19499,12 +18106,6 @@
         </w:tc>
       </w:tr>
       <w:tr>
-        <w:tblPrEx>
-          <w:tblCellMar>
-            <w:top w:w="0" w:type="dxa"/>
-            <w:bottom w:w="0" w:type="dxa"/>
-          </w:tblCellMar>
-        </w:tblPrEx>
         <w:tc>
           <w:tcPr>
             <w:tcW w:w="2200" w:type="dxa"/>
@@ -19573,12 +18174,6 @@
         </w:tc>
       </w:tr>
       <w:tr>
-        <w:tblPrEx>
-          <w:tblCellMar>
-            <w:top w:w="0" w:type="dxa"/>
-            <w:bottom w:w="0" w:type="dxa"/>
-          </w:tblCellMar>
-        </w:tblPrEx>
         <w:tc>
           <w:tcPr>
             <w:tcW w:w="2200" w:type="dxa"/>
@@ -19694,12 +18289,6 @@
         </w:tc>
       </w:tr>
       <w:tr>
-        <w:tblPrEx>
-          <w:tblCellMar>
-            <w:top w:w="0" w:type="dxa"/>
-            <w:bottom w:w="0" w:type="dxa"/>
-          </w:tblCellMar>
-        </w:tblPrEx>
         <w:tc>
           <w:tcPr>
             <w:tcW w:w="2200" w:type="dxa"/>
@@ -19779,12 +18368,6 @@
         <w:gridCol w:w="7160"/>
       </w:tblGrid>
       <w:tr>
-        <w:tblPrEx>
-          <w:tblCellMar>
-            <w:top w:w="0" w:type="dxa"/>
-            <w:bottom w:w="0" w:type="dxa"/>
-          </w:tblCellMar>
-        </w:tblPrEx>
         <w:tc>
           <w:tcPr>
             <w:tcW w:w="9360" w:type="dxa"/>
@@ -19818,12 +18401,6 @@
         </w:tc>
       </w:tr>
       <w:tr>
-        <w:tblPrEx>
-          <w:tblCellMar>
-            <w:top w:w="0" w:type="dxa"/>
-            <w:bottom w:w="0" w:type="dxa"/>
-          </w:tblCellMar>
-        </w:tblPrEx>
         <w:tc>
           <w:tcPr>
             <w:tcW w:w="2200" w:type="dxa"/>
@@ -19876,12 +18453,6 @@
         </w:tc>
       </w:tr>
       <w:tr>
-        <w:tblPrEx>
-          <w:tblCellMar>
-            <w:top w:w="0" w:type="dxa"/>
-            <w:bottom w:w="0" w:type="dxa"/>
-          </w:tblCellMar>
-        </w:tblPrEx>
         <w:tc>
           <w:tcPr>
             <w:tcW w:w="2200" w:type="dxa"/>
@@ -19935,12 +18506,6 @@
         </w:tc>
       </w:tr>
       <w:tr>
-        <w:tblPrEx>
-          <w:tblCellMar>
-            <w:top w:w="0" w:type="dxa"/>
-            <w:bottom w:w="0" w:type="dxa"/>
-          </w:tblCellMar>
-        </w:tblPrEx>
         <w:tc>
           <w:tcPr>
             <w:tcW w:w="2200" w:type="dxa"/>
@@ -20001,12 +18566,6 @@
         </w:tc>
       </w:tr>
       <w:tr>
-        <w:tblPrEx>
-          <w:tblCellMar>
-            <w:top w:w="0" w:type="dxa"/>
-            <w:bottom w:w="0" w:type="dxa"/>
-          </w:tblCellMar>
-        </w:tblPrEx>
         <w:tc>
           <w:tcPr>
             <w:tcW w:w="2200" w:type="dxa"/>
@@ -20119,12 +18678,6 @@
         </w:tc>
       </w:tr>
       <w:tr>
-        <w:tblPrEx>
-          <w:tblCellMar>
-            <w:top w:w="0" w:type="dxa"/>
-            <w:bottom w:w="0" w:type="dxa"/>
-          </w:tblCellMar>
-        </w:tblPrEx>
         <w:tc>
           <w:tcPr>
             <w:tcW w:w="2200" w:type="dxa"/>
@@ -20204,12 +18757,6 @@
         <w:gridCol w:w="7160"/>
       </w:tblGrid>
       <w:tr>
-        <w:tblPrEx>
-          <w:tblCellMar>
-            <w:top w:w="0" w:type="dxa"/>
-            <w:bottom w:w="0" w:type="dxa"/>
-          </w:tblCellMar>
-        </w:tblPrEx>
         <w:tc>
           <w:tcPr>
             <w:tcW w:w="9360" w:type="dxa"/>
@@ -20252,12 +18799,6 @@
         </w:tc>
       </w:tr>
       <w:tr>
-        <w:tblPrEx>
-          <w:tblCellMar>
-            <w:top w:w="0" w:type="dxa"/>
-            <w:bottom w:w="0" w:type="dxa"/>
-          </w:tblCellMar>
-        </w:tblPrEx>
         <w:tc>
           <w:tcPr>
             <w:tcW w:w="2200" w:type="dxa"/>
@@ -20310,12 +18851,6 @@
         </w:tc>
       </w:tr>
       <w:tr>
-        <w:tblPrEx>
-          <w:tblCellMar>
-            <w:top w:w="0" w:type="dxa"/>
-            <w:bottom w:w="0" w:type="dxa"/>
-          </w:tblCellMar>
-        </w:tblPrEx>
         <w:tc>
           <w:tcPr>
             <w:tcW w:w="2200" w:type="dxa"/>
@@ -20366,16 +18901,19 @@
               <w:t>Explicabilidad</w:t>
             </w:r>
             <w:proofErr w:type="spellEnd"/>
-          </w:p>
-        </w:tc>
-      </w:tr>
-      <w:tr>
-        <w:tblPrEx>
-          <w:tblCellMar>
-            <w:top w:w="0" w:type="dxa"/>
-            <w:bottom w:w="0" w:type="dxa"/>
-          </w:tblCellMar>
-        </w:tblPrEx>
+            <w:r>
+              <w:t xml:space="preserve"> </w:t>
+            </w:r>
+            <w:r>
+              <w:rPr>
+                <w:color w:val="EE0000"/>
+              </w:rPr>
+              <w:t>OBSERVAR PARA MODIFICAR</w:t>
+            </w:r>
+          </w:p>
+        </w:tc>
+      </w:tr>
+      <w:tr>
         <w:tc>
           <w:tcPr>
             <w:tcW w:w="2200" w:type="dxa"/>
@@ -20444,12 +18982,6 @@
         </w:tc>
       </w:tr>
       <w:tr>
-        <w:tblPrEx>
-          <w:tblCellMar>
-            <w:top w:w="0" w:type="dxa"/>
-            <w:bottom w:w="0" w:type="dxa"/>
-          </w:tblCellMar>
-        </w:tblPrEx>
         <w:tc>
           <w:tcPr>
             <w:tcW w:w="2200" w:type="dxa"/>
@@ -20573,12 +19105,6 @@
         </w:tc>
       </w:tr>
       <w:tr>
-        <w:tblPrEx>
-          <w:tblCellMar>
-            <w:top w:w="0" w:type="dxa"/>
-            <w:bottom w:w="0" w:type="dxa"/>
-          </w:tblCellMar>
-        </w:tblPrEx>
         <w:tc>
           <w:tcPr>
             <w:tcW w:w="2200" w:type="dxa"/>
@@ -20658,12 +19184,6 @@
         <w:gridCol w:w="7160"/>
       </w:tblGrid>
       <w:tr>
-        <w:tblPrEx>
-          <w:tblCellMar>
-            <w:top w:w="0" w:type="dxa"/>
-            <w:bottom w:w="0" w:type="dxa"/>
-          </w:tblCellMar>
-        </w:tblPrEx>
         <w:tc>
           <w:tcPr>
             <w:tcW w:w="9360" w:type="dxa"/>
@@ -20697,12 +19217,6 @@
         </w:tc>
       </w:tr>
       <w:tr>
-        <w:tblPrEx>
-          <w:tblCellMar>
-            <w:top w:w="0" w:type="dxa"/>
-            <w:bottom w:w="0" w:type="dxa"/>
-          </w:tblCellMar>
-        </w:tblPrEx>
         <w:tc>
           <w:tcPr>
             <w:tcW w:w="2200" w:type="dxa"/>
@@ -20755,12 +19269,6 @@
         </w:tc>
       </w:tr>
       <w:tr>
-        <w:tblPrEx>
-          <w:tblCellMar>
-            <w:top w:w="0" w:type="dxa"/>
-            <w:bottom w:w="0" w:type="dxa"/>
-          </w:tblCellMar>
-        </w:tblPrEx>
         <w:tc>
           <w:tcPr>
             <w:tcW w:w="2200" w:type="dxa"/>
@@ -20813,12 +19321,6 @@
         </w:tc>
       </w:tr>
       <w:tr>
-        <w:tblPrEx>
-          <w:tblCellMar>
-            <w:top w:w="0" w:type="dxa"/>
-            <w:bottom w:w="0" w:type="dxa"/>
-          </w:tblCellMar>
-        </w:tblPrEx>
         <w:tc>
           <w:tcPr>
             <w:tcW w:w="2200" w:type="dxa"/>
@@ -20899,12 +19401,6 @@
         </w:tc>
       </w:tr>
       <w:tr>
-        <w:tblPrEx>
-          <w:tblCellMar>
-            <w:top w:w="0" w:type="dxa"/>
-            <w:bottom w:w="0" w:type="dxa"/>
-          </w:tblCellMar>
-        </w:tblPrEx>
         <w:tc>
           <w:tcPr>
             <w:tcW w:w="2200" w:type="dxa"/>
@@ -21037,12 +19533,6 @@
         </w:tc>
       </w:tr>
       <w:tr>
-        <w:tblPrEx>
-          <w:tblCellMar>
-            <w:top w:w="0" w:type="dxa"/>
-            <w:bottom w:w="0" w:type="dxa"/>
-          </w:tblCellMar>
-        </w:tblPrEx>
         <w:tc>
           <w:tcPr>
             <w:tcW w:w="2200" w:type="dxa"/>
@@ -21122,12 +19612,6 @@
         <w:gridCol w:w="7160"/>
       </w:tblGrid>
       <w:tr>
-        <w:tblPrEx>
-          <w:tblCellMar>
-            <w:top w:w="0" w:type="dxa"/>
-            <w:bottom w:w="0" w:type="dxa"/>
-          </w:tblCellMar>
-        </w:tblPrEx>
         <w:tc>
           <w:tcPr>
             <w:tcW w:w="9360" w:type="dxa"/>
@@ -21161,12 +19645,6 @@
         </w:tc>
       </w:tr>
       <w:tr>
-        <w:tblPrEx>
-          <w:tblCellMar>
-            <w:top w:w="0" w:type="dxa"/>
-            <w:bottom w:w="0" w:type="dxa"/>
-          </w:tblCellMar>
-        </w:tblPrEx>
         <w:tc>
           <w:tcPr>
             <w:tcW w:w="2200" w:type="dxa"/>
@@ -21219,12 +19697,6 @@
         </w:tc>
       </w:tr>
       <w:tr>
-        <w:tblPrEx>
-          <w:tblCellMar>
-            <w:top w:w="0" w:type="dxa"/>
-            <w:bottom w:w="0" w:type="dxa"/>
-          </w:tblCellMar>
-        </w:tblPrEx>
         <w:tc>
           <w:tcPr>
             <w:tcW w:w="2200" w:type="dxa"/>
@@ -21277,12 +19749,6 @@
         </w:tc>
       </w:tr>
       <w:tr>
-        <w:tblPrEx>
-          <w:tblCellMar>
-            <w:top w:w="0" w:type="dxa"/>
-            <w:bottom w:w="0" w:type="dxa"/>
-          </w:tblCellMar>
-        </w:tblPrEx>
         <w:tc>
           <w:tcPr>
             <w:tcW w:w="2200" w:type="dxa"/>
@@ -21351,12 +19817,6 @@
         </w:tc>
       </w:tr>
       <w:tr>
-        <w:tblPrEx>
-          <w:tblCellMar>
-            <w:top w:w="0" w:type="dxa"/>
-            <w:bottom w:w="0" w:type="dxa"/>
-          </w:tblCellMar>
-        </w:tblPrEx>
         <w:tc>
           <w:tcPr>
             <w:tcW w:w="2200" w:type="dxa"/>
@@ -21472,12 +19932,6 @@
         </w:tc>
       </w:tr>
       <w:tr>
-        <w:tblPrEx>
-          <w:tblCellMar>
-            <w:top w:w="0" w:type="dxa"/>
-            <w:bottom w:w="0" w:type="dxa"/>
-          </w:tblCellMar>
-        </w:tblPrEx>
         <w:tc>
           <w:tcPr>
             <w:tcW w:w="2200" w:type="dxa"/>
@@ -21557,12 +20011,6 @@
         <w:gridCol w:w="7160"/>
       </w:tblGrid>
       <w:tr>
-        <w:tblPrEx>
-          <w:tblCellMar>
-            <w:top w:w="0" w:type="dxa"/>
-            <w:bottom w:w="0" w:type="dxa"/>
-          </w:tblCellMar>
-        </w:tblPrEx>
         <w:tc>
           <w:tcPr>
             <w:tcW w:w="9360" w:type="dxa"/>
@@ -21596,12 +20044,6 @@
         </w:tc>
       </w:tr>
       <w:tr>
-        <w:tblPrEx>
-          <w:tblCellMar>
-            <w:top w:w="0" w:type="dxa"/>
-            <w:bottom w:w="0" w:type="dxa"/>
-          </w:tblCellMar>
-        </w:tblPrEx>
         <w:tc>
           <w:tcPr>
             <w:tcW w:w="2200" w:type="dxa"/>
@@ -21654,12 +20096,6 @@
         </w:tc>
       </w:tr>
       <w:tr>
-        <w:tblPrEx>
-          <w:tblCellMar>
-            <w:top w:w="0" w:type="dxa"/>
-            <w:bottom w:w="0" w:type="dxa"/>
-          </w:tblCellMar>
-        </w:tblPrEx>
         <w:tc>
           <w:tcPr>
             <w:tcW w:w="2200" w:type="dxa"/>
@@ -21706,18 +20142,18 @@
           </w:tcPr>
           <w:p>
             <w:r>
-              <w:t>Compatibilidad / Cumplimiento</w:t>
-            </w:r>
-          </w:p>
-        </w:tc>
-      </w:tr>
-      <w:tr>
-        <w:tblPrEx>
-          <w:tblCellMar>
-            <w:top w:w="0" w:type="dxa"/>
-            <w:bottom w:w="0" w:type="dxa"/>
-          </w:tblCellMar>
-        </w:tblPrEx>
+              <w:t>Compatibilidad /</w:t>
+            </w:r>
+            <w:r>
+              <w:rPr>
+                <w:color w:val="EE0000"/>
+              </w:rPr>
+              <w:t xml:space="preserve"> Cumplimiento</w:t>
+            </w:r>
+          </w:p>
+        </w:tc>
+      </w:tr>
+      <w:tr>
         <w:tc>
           <w:tcPr>
             <w:tcW w:w="2200" w:type="dxa"/>
@@ -21778,12 +20214,6 @@
         </w:tc>
       </w:tr>
       <w:tr>
-        <w:tblPrEx>
-          <w:tblCellMar>
-            <w:top w:w="0" w:type="dxa"/>
-            <w:bottom w:w="0" w:type="dxa"/>
-          </w:tblCellMar>
-        </w:tblPrEx>
         <w:tc>
           <w:tcPr>
             <w:tcW w:w="2200" w:type="dxa"/>
@@ -21900,12 +20330,6 @@
         </w:tc>
       </w:tr>
       <w:tr>
-        <w:tblPrEx>
-          <w:tblCellMar>
-            <w:top w:w="0" w:type="dxa"/>
-            <w:bottom w:w="0" w:type="dxa"/>
-          </w:tblCellMar>
-        </w:tblPrEx>
         <w:tc>
           <w:tcPr>
             <w:tcW w:w="2200" w:type="dxa"/>
@@ -22030,12 +20454,6 @@
         <w:gridCol w:w="1760"/>
       </w:tblGrid>
       <w:tr>
-        <w:tblPrEx>
-          <w:tblCellMar>
-            <w:top w:w="0" w:type="dxa"/>
-            <w:bottom w:w="0" w:type="dxa"/>
-          </w:tblCellMar>
-        </w:tblPrEx>
         <w:tc>
           <w:tcPr>
             <w:tcW w:w="1100" w:type="dxa"/>
@@ -22175,12 +20593,6 @@
         </w:tc>
       </w:tr>
       <w:tr>
-        <w:tblPrEx>
-          <w:tblCellMar>
-            <w:top w:w="0" w:type="dxa"/>
-            <w:bottom w:w="0" w:type="dxa"/>
-          </w:tblCellMar>
-        </w:tblPrEx>
         <w:tc>
           <w:tcPr>
             <w:tcW w:w="1100" w:type="dxa"/>
@@ -22298,12 +20710,6 @@
         </w:tc>
       </w:tr>
       <w:tr>
-        <w:tblPrEx>
-          <w:tblCellMar>
-            <w:top w:w="0" w:type="dxa"/>
-            <w:bottom w:w="0" w:type="dxa"/>
-          </w:tblCellMar>
-        </w:tblPrEx>
         <w:tc>
           <w:tcPr>
             <w:tcW w:w="1100" w:type="dxa"/>
@@ -22421,12 +20827,6 @@
         </w:tc>
       </w:tr>
       <w:tr>
-        <w:tblPrEx>
-          <w:tblCellMar>
-            <w:top w:w="0" w:type="dxa"/>
-            <w:bottom w:w="0" w:type="dxa"/>
-          </w:tblCellMar>
-        </w:tblPrEx>
         <w:tc>
           <w:tcPr>
             <w:tcW w:w="1100" w:type="dxa"/>
@@ -22544,12 +20944,6 @@
         </w:tc>
       </w:tr>
       <w:tr>
-        <w:tblPrEx>
-          <w:tblCellMar>
-            <w:top w:w="0" w:type="dxa"/>
-            <w:bottom w:w="0" w:type="dxa"/>
-          </w:tblCellMar>
-        </w:tblPrEx>
         <w:tc>
           <w:tcPr>
             <w:tcW w:w="1100" w:type="dxa"/>
@@ -22667,12 +21061,6 @@
         </w:tc>
       </w:tr>
       <w:tr>
-        <w:tblPrEx>
-          <w:tblCellMar>
-            <w:top w:w="0" w:type="dxa"/>
-            <w:bottom w:w="0" w:type="dxa"/>
-          </w:tblCellMar>
-        </w:tblPrEx>
         <w:tc>
           <w:tcPr>
             <w:tcW w:w="1100" w:type="dxa"/>
@@ -22798,12 +21186,6 @@
         </w:tc>
       </w:tr>
       <w:tr>
-        <w:tblPrEx>
-          <w:tblCellMar>
-            <w:top w:w="0" w:type="dxa"/>
-            <w:bottom w:w="0" w:type="dxa"/>
-          </w:tblCellMar>
-        </w:tblPrEx>
         <w:tc>
           <w:tcPr>
             <w:tcW w:w="1100" w:type="dxa"/>
@@ -22921,12 +21303,6 @@
         </w:tc>
       </w:tr>
       <w:tr>
-        <w:tblPrEx>
-          <w:tblCellMar>
-            <w:top w:w="0" w:type="dxa"/>
-            <w:bottom w:w="0" w:type="dxa"/>
-          </w:tblCellMar>
-        </w:tblPrEx>
         <w:tc>
           <w:tcPr>
             <w:tcW w:w="1100" w:type="dxa"/>
@@ -23049,12 +21425,6 @@
         </w:tc>
       </w:tr>
       <w:tr>
-        <w:tblPrEx>
-          <w:tblCellMar>
-            <w:top w:w="0" w:type="dxa"/>
-            <w:bottom w:w="0" w:type="dxa"/>
-          </w:tblCellMar>
-        </w:tblPrEx>
         <w:tc>
           <w:tcPr>
             <w:tcW w:w="1100" w:type="dxa"/>
@@ -23180,12 +21550,6 @@
         </w:tc>
       </w:tr>
       <w:tr>
-        <w:tblPrEx>
-          <w:tblCellMar>
-            <w:top w:w="0" w:type="dxa"/>
-            <w:bottom w:w="0" w:type="dxa"/>
-          </w:tblCellMar>
-        </w:tblPrEx>
         <w:tc>
           <w:tcPr>
             <w:tcW w:w="1100" w:type="dxa"/>
@@ -23308,12 +21672,6 @@
         </w:tc>
       </w:tr>
       <w:tr>
-        <w:tblPrEx>
-          <w:tblCellMar>
-            <w:top w:w="0" w:type="dxa"/>
-            <w:bottom w:w="0" w:type="dxa"/>
-          </w:tblCellMar>
-        </w:tblPrEx>
         <w:tc>
           <w:tcPr>
             <w:tcW w:w="1100" w:type="dxa"/>
@@ -23431,12 +21789,6 @@
         </w:tc>
       </w:tr>
       <w:tr>
-        <w:tblPrEx>
-          <w:tblCellMar>
-            <w:top w:w="0" w:type="dxa"/>
-            <w:bottom w:w="0" w:type="dxa"/>
-          </w:tblCellMar>
-        </w:tblPrEx>
         <w:tc>
           <w:tcPr>
             <w:tcW w:w="1100" w:type="dxa"/>
@@ -23554,12 +21906,6 @@
         </w:tc>
       </w:tr>
       <w:tr>
-        <w:tblPrEx>
-          <w:tblCellMar>
-            <w:top w:w="0" w:type="dxa"/>
-            <w:bottom w:w="0" w:type="dxa"/>
-          </w:tblCellMar>
-        </w:tblPrEx>
         <w:tc>
           <w:tcPr>
             <w:tcW w:w="1100" w:type="dxa"/>
@@ -23677,12 +22023,6 @@
         </w:tc>
       </w:tr>
       <w:tr>
-        <w:tblPrEx>
-          <w:tblCellMar>
-            <w:top w:w="0" w:type="dxa"/>
-            <w:bottom w:w="0" w:type="dxa"/>
-          </w:tblCellMar>
-        </w:tblPrEx>
         <w:tc>
           <w:tcPr>
             <w:tcW w:w="1100" w:type="dxa"/>
@@ -23805,12 +22145,6 @@
         </w:tc>
       </w:tr>
       <w:tr>
-        <w:tblPrEx>
-          <w:tblCellMar>
-            <w:top w:w="0" w:type="dxa"/>
-            <w:bottom w:w="0" w:type="dxa"/>
-          </w:tblCellMar>
-        </w:tblPrEx>
         <w:tc>
           <w:tcPr>
             <w:tcW w:w="1100" w:type="dxa"/>
@@ -23928,12 +22262,6 @@
         </w:tc>
       </w:tr>
       <w:tr>
-        <w:tblPrEx>
-          <w:tblCellMar>
-            <w:top w:w="0" w:type="dxa"/>
-            <w:bottom w:w="0" w:type="dxa"/>
-          </w:tblCellMar>
-        </w:tblPrEx>
         <w:tc>
           <w:tcPr>
             <w:tcW w:w="1100" w:type="dxa"/>
@@ -24051,12 +22379,6 @@
         </w:tc>
       </w:tr>
       <w:tr>
-        <w:tblPrEx>
-          <w:tblCellMar>
-            <w:top w:w="0" w:type="dxa"/>
-            <w:bottom w:w="0" w:type="dxa"/>
-          </w:tblCellMar>
-        </w:tblPrEx>
         <w:tc>
           <w:tcPr>
             <w:tcW w:w="1100" w:type="dxa"/>
@@ -24174,12 +22496,6 @@
         </w:tc>
       </w:tr>
       <w:tr>
-        <w:tblPrEx>
-          <w:tblCellMar>
-            <w:top w:w="0" w:type="dxa"/>
-            <w:bottom w:w="0" w:type="dxa"/>
-          </w:tblCellMar>
-        </w:tblPrEx>
         <w:tc>
           <w:tcPr>
             <w:tcW w:w="1100" w:type="dxa"/>
@@ -24297,12 +22613,6 @@
         </w:tc>
       </w:tr>
       <w:tr>
-        <w:tblPrEx>
-          <w:tblCellMar>
-            <w:top w:w="0" w:type="dxa"/>
-            <w:bottom w:w="0" w:type="dxa"/>
-          </w:tblCellMar>
-        </w:tblPrEx>
         <w:tc>
           <w:tcPr>
             <w:tcW w:w="1100" w:type="dxa"/>
@@ -24421,12 +22731,6 @@
         </w:tc>
       </w:tr>
       <w:tr>
-        <w:tblPrEx>
-          <w:tblCellMar>
-            <w:top w:w="0" w:type="dxa"/>
-            <w:bottom w:w="0" w:type="dxa"/>
-          </w:tblCellMar>
-        </w:tblPrEx>
         <w:tc>
           <w:tcPr>
             <w:tcW w:w="1100" w:type="dxa"/>
@@ -24544,12 +22848,6 @@
         </w:tc>
       </w:tr>
       <w:tr>
-        <w:tblPrEx>
-          <w:tblCellMar>
-            <w:top w:w="0" w:type="dxa"/>
-            <w:bottom w:w="0" w:type="dxa"/>
-          </w:tblCellMar>
-        </w:tblPrEx>
         <w:tc>
           <w:tcPr>
             <w:tcW w:w="1100" w:type="dxa"/>
@@ -25808,4 +24106,16 @@
     </a:ext>
   </a:extLst>
 </a:theme>
+</file>
+
+<file path=customXml/item1.xml><?xml version="1.0" encoding="utf-8"?>
+<b:Sources xmlns:b="http://schemas.openxmlformats.org/officeDocument/2006/bibliography" xmlns="http://schemas.openxmlformats.org/officeDocument/2006/bibliography" SelectedStyle="\APASixthEditionOfficeOnline.xsl" StyleName="APA" Version="6"/>
+</file>
+
+<file path=customXml/itemProps1.xml><?xml version="1.0" encoding="utf-8"?>
+<ds:datastoreItem xmlns:ds="http://schemas.openxmlformats.org/officeDocument/2006/customXml" ds:itemID="{A6EE3A50-D02C-4C18-B790-BAC499DB1A0E}">
+  <ds:schemaRefs>
+    <ds:schemaRef ds:uri="http://schemas.openxmlformats.org/officeDocument/2006/bibliography"/>
+  </ds:schemaRefs>
+</ds:datastoreItem>
 </file>
</xml_diff>